<commit_message>
Complete Word docs: informed consent, anonymization, Prof. Dr. title fix
- Word docs now include full informed consent statement on title page
  (submission = geïnformeerde toestemming) and explicit anonymization notice
- Final page of Word docs has complete vertrouwelijkheid/verwerking block
- Fixed promotor title: Prof. Dr. Geert Crombez (in both PDF and Word)
- Doel van deze bundel section fully written out in Word
- Checklist expanded with withdrawal rights and anonymization acknowledgement
- PDF updated with Prof. Dr. fix in preamble

Co-Authored-By: Claude Sonnet 4.6 <noreply@anthropic.com>
</commit_message>
<xml_diff>
--- a/evaluation/qualtrics/01_HCPs_PRE/separate_HCPs/HCP_1/main.docx
+++ b/evaluation/qualtrics/01_HCPs_PRE/separate_HCPs/HCP_1/main.docx
@@ -68,7 +68,7 @@
               <w:rPr>
                 <w:sz w:val="18"/>
               </w:rPr>
-              <w:t>Evaluatie van de klinische kwaliteit van het PHOENIX multi-agentsysteem (masterproef UGent)</w:t>
+              <w:t>Evaluatie van de klinische kwaliteit van een ontologiegebaseerd multi-agentsysteem voor gepersonaliseerde digitale geestelijke gezondheidszorg (PHOENIX)</w:t>
             </w:r>
           </w:p>
         </w:tc>
@@ -126,7 +126,7 @@
               <w:rPr>
                 <w:sz w:val="18"/>
               </w:rPr>
-              <w:t>Stijn Van Severen</w:t>
+              <w:t>Stijn Van Severen (masterproefstudent)</w:t>
             </w:r>
           </w:p>
         </w:tc>
@@ -155,7 +155,7 @@
               <w:rPr>
                 <w:sz w:val="18"/>
               </w:rPr>
-              <w:t>Prof. Geert Crombez; Dr. Annick De Paepe</w:t>
+              <w:t>Prof. Dr. Geert Crombez; Dr. Annick De Paepe</w:t>
             </w:r>
           </w:p>
         </w:tc>
@@ -221,12 +221,53 @@
     </w:tbl>
     <w:p/>
     <w:p>
+      <w:pPr>
+        <w:shd w:val="clear" w:color="auto" w:fill="DBEAFE"/>
+      </w:pPr>
       <w:r>
         <w:rPr>
-          <w:i/>
-          <w:sz w:val="18"/>
+          <w:sz w:val="20"/>
         </w:rPr>
-        <w:t>Vertrouwelijkheid: uw antwoorden worden voor analyse geanonimiseerd en uitsluitend gebruikt binnen deze masterproefstudie. Deelname is vrijwillig.</w:t>
+        <w:t>DOEL VAN DEZE BUNDEL</w:t>
+        <w:br/>
+        <w:br/>
+        <w:t>U neemt deel aan een evaluatiestudie waarin zorgprofessionals onafhankelijk dezelfde vijf klinische redeneerstappen uitvoeren als het PHOENIX-systeem. Uw antwoorden vormen het menselijke referentiecorpus voor een latere dubbelblinde vergelijking met systeemoutput.</w:t>
+        <w:br/>
+        <w:br/>
+        <w:t>Voor elk van uw twee casussen vult u dezelfde vijf delen in: (1) operationalisering, (2) initieel observatiemodel, (3) prioritering van behandeldoelen, (4) verfijning van EMA-metingen en (5) een mobiele coachingsboodschap.</w:t>
+        <w:br/>
+        <w:br/>
+        <w:t>We vragen uw eigen klinische oordeelsvorming. Antwoord zoals u dat in een reele professionele context zou doen, maar werk strikt volgens de instructies op de volgende pagina.</w:t>
+      </w:r>
+    </w:p>
+    <w:p/>
+    <w:p>
+      <w:pPr>
+        <w:shd w:val="clear" w:color="auto" w:fill="FEF3C7"/>
+      </w:pPr>
+      <w:r>
+        <w:rPr>
+          <w:sz w:val="20"/>
+        </w:rPr>
+        <w:t>VERTROUWELIJKHEID EN GEÏNFORMEERDE TOESTEMMING</w:t>
+        <w:br/>
+        <w:br/>
+        <w:t>Uw antwoorden worden voor analyse geanonimiseerd en uitsluitend gebruikt binnen deze masterproefstudie. Na ontvangst worden ze opgenomen in het expertreferentiecorpus voor de latere blind evaluatie van het PHOENIX-systeem.</w:t>
+        <w:br/>
+        <w:br/>
+        <w:t>Deelname is volledig vrijwillig. U kan zich op elk moment zonder opgave van reden terugtrekken door contact op te nemen met de onderzoeker via stijn.vanseveren@ugent.be. Terugtrekking heeft geen gevolgen.</w:t>
+        <w:br/>
+        <w:br/>
+        <w:t>Door dit ingevulde document te bezorgen aan de onderzoeker, bevestigt u dat:</w:t>
+        <w:br/>
+        <w:t xml:space="preserve">  (1) u de bovenstaande informatie hebt gelezen en begrepen;</w:t>
+        <w:br/>
+        <w:t xml:space="preserve">  (2) u vrijwillig instemt met deelname aan deze studie;</w:t>
+        <w:br/>
+        <w:t xml:space="preserve">  (3) u begrijpt dat uw antwoorden geanonimiseerd worden verwerkt.</w:t>
+        <w:br/>
+        <w:br/>
+        <w:t>Uw inzending geldt als geïnformeerde toestemming.</w:t>
       </w:r>
     </w:p>
     <w:p>
@@ -707,13 +748,13 @@
         <w:br/>
         <w:t>1. Werk sequentieel: Deel 1 -&gt; Deel 5. Ga pas naar een volgend deel wanneer het huidige volledig is afgewerkt voor beide casussen.</w:t>
         <w:br/>
-        <w:t>2. Gebruik geen generatieve AI, schrijfhulpmiddelen, richtlijnen of collegaoverleg. Extern gebruik ondermijnt de methodologische validiteit van de studie.</w:t>
+        <w:t>2. Gebruik geen generatieve AI, schrijfhulpmiddelen, richtlijnen of collegaoverleg. Extern gebruik ondermijnt de methodologische validiteit en de blind scoringswaarde van de studie.</w:t>
         <w:br/>
-        <w:t>3. Gebruik in latere delen uitsluitend de meegeleverde gestandaardiseerde context.</w:t>
+        <w:t>3. Gebruik in latere delen uitsluitend de meegeleverde gestandaardiseerde context. Die is bewust vastgezet zodat alle deelnemers op identieke input reageren.</w:t>
         <w:br/>
         <w:t>4. Herwerk eerdere antwoorden NIET retroactief nadat u latere context hebt gezien.</w:t>
         <w:br/>
-        <w:t>5. Noteer of typ rechtstreeks in de voorziene antwoordzones.</w:t>
+        <w:t>5. Noteer of typ rechtstreeks in de voorziene antwoordzones. Onleesbare of ambigu geformuleerde antwoorden bemoeilijken latere blind beoordeling.</w:t>
       </w:r>
     </w:p>
     <w:p/>
@@ -727,7 +768,18 @@
         </w:rPr>
         <w:t>EMA-PRINCIPES (relevant voor Deel 2 en Deel 4):</w:t>
         <w:br/>
-        <w:t>Ecological Momentary Assessment (EMA) meet dagelijkse schommelingen via een mobiele app. Elke EMA-variabele moet: (1) dagelijks rapporteerbaar zijn via een korte smartphone-vraag; (2) dynamisch en veranderbaar zijn (geen diagnose of trait); (3) meetbaar zijn als ja/nee, aantal, minuten of een 0-10 score; (4) klinisch relevante binnen-persoonsvariatie tonen. In Deel 2 genereert u zelf predictorlabels. In Deel 4 selecteert u de meest geschikte 5 uit 20 reeds uitgewerkte EMA-items.</w:t>
+        <w:t>Ecological Momentary Assessment (EMA) meet dagelijkse schommelingen via een mobiele app. Elke EMA-variabele moet aan vier vereisten voldoen:</w:t>
+        <w:br/>
+        <w:t xml:space="preserve">  (1) Dagelijks rapporteerbaar via een korte smartphone-vraag.</w:t>
+        <w:br/>
+        <w:t xml:space="preserve">  (2) Dynamisch en veranderbaar -- geen vaste diagnose, trait of achtergrondkenmerk.</w:t>
+        <w:br/>
+        <w:t xml:space="preserve">  (3) Meetbaar in een eenvoudig format: ja/nee, aantal, minuten of een 0-10 score.</w:t>
+        <w:br/>
+        <w:t xml:space="preserve">  (4) Klinisch relevant voor opvolging -- toont binnen-persoonsvariatie die therapeutisch informatief is.</w:t>
+        <w:br/>
+        <w:br/>
+        <w:t>In Deel 2 genereert u zelf predictorlabels. In Deel 4 zijn de 20 kandidaat-items reeds uitgewerkt als dagelijkse EMA-items; u selecteert de meest geschikte 5.</w:t>
       </w:r>
     </w:p>
     <w:p>
@@ -2992,91 +3044,151 @@
     </w:p>
     <w:p/>
     <w:p>
+      <w:r>
+        <w:rPr>
+          <w:b/>
+          <w:sz w:val="20"/>
+        </w:rPr>
+        <w:t>Checklist voor terugbezorging -- gelieve alle vakjes af te vinken:</w:t>
+      </w:r>
+    </w:p>
+    <w:p>
       <w:pPr>
-        <w:pStyle w:val="ListBullet"/>
+        <w:spacing w:after="60"/>
+        <w:ind w:left="170"/>
       </w:pPr>
       <w:r>
         <w:rPr>
           <w:sz w:val="20"/>
         </w:rPr>
-        <w:t>□  Deel 1: criteriumlabels ingevuld voor C01 en C02</w:t>
+        <w:t>□   Ik heb in Deel 1 voor beide casussen (C01 en C02) criteriumlabels ingevuld.</w:t>
       </w:r>
     </w:p>
     <w:p>
       <w:pPr>
-        <w:pStyle w:val="ListBullet"/>
+        <w:spacing w:after="60"/>
+        <w:ind w:left="170"/>
       </w:pPr>
       <w:r>
         <w:rPr>
           <w:sz w:val="20"/>
         </w:rPr>
-        <w:t>□  Deel 2: predictorlabels ingevuld voor C01 en C02</w:t>
+        <w:t>□   Ik heb in Deel 2 voor beide casussen predictorlabels ingevuld.</w:t>
       </w:r>
     </w:p>
     <w:p>
       <w:pPr>
-        <w:pStyle w:val="ListBullet"/>
+        <w:spacing w:after="60"/>
+        <w:ind w:left="170"/>
       </w:pPr>
       <w:r>
         <w:rPr>
           <w:sz w:val="20"/>
         </w:rPr>
-        <w:t>□  Deel 3: alle 5 predictors gerangschikt voor beide casussen</w:t>
+        <w:t>□   Ik heb in Deel 3 voor beide casussen alle 5 predictors gerangschikt.</w:t>
       </w:r>
     </w:p>
     <w:p>
       <w:pPr>
-        <w:pStyle w:val="ListBullet"/>
+        <w:spacing w:after="60"/>
+        <w:ind w:left="170"/>
       </w:pPr>
       <w:r>
         <w:rPr>
           <w:sz w:val="20"/>
         </w:rPr>
-        <w:t>□  Deel 4: exact 5 EMA-items geselecteerd voor beide casussen</w:t>
+        <w:t>□   Ik heb in Deel 4 voor beide casussen exact 5 EMA-items geselecteerd.</w:t>
       </w:r>
     </w:p>
     <w:p>
       <w:pPr>
-        <w:pStyle w:val="ListBullet"/>
+        <w:spacing w:after="60"/>
+        <w:ind w:left="170"/>
       </w:pPr>
       <w:r>
         <w:rPr>
           <w:sz w:val="20"/>
         </w:rPr>
-        <w:t>□  Deel 5: mobiele coachingsboodschap geschreven voor beide casussen</w:t>
+        <w:t>□   Ik heb in Deel 5 voor beide casussen een mobiele coachingsboodschap geschreven.</w:t>
       </w:r>
     </w:p>
     <w:p>
       <w:pPr>
-        <w:pStyle w:val="ListBullet"/>
+        <w:spacing w:after="60"/>
+        <w:ind w:left="170"/>
       </w:pPr>
       <w:r>
         <w:rPr>
           <w:sz w:val="20"/>
         </w:rPr>
-        <w:t>□  Antwoorden weerspiegelen mijn eigen klinische oordeel zonder externe hulp</w:t>
+        <w:t>□   Mijn antwoorden weerspiegelen mijn eigen klinische oordeel zonder gebruik van generatieve AI of andere externe hulp.</w:t>
       </w:r>
     </w:p>
     <w:p>
       <w:pPr>
-        <w:pStyle w:val="ListBullet"/>
+        <w:spacing w:after="60"/>
+        <w:ind w:left="170"/>
       </w:pPr>
       <w:r>
         <w:rPr>
           <w:sz w:val="20"/>
         </w:rPr>
-        <w:t>□  Ik begrijp dat mijn antwoorden geanonimiseerd worden voor analyse</w:t>
+        <w:t>□   Ik begrijp dat mijn antwoorden geanonimiseerd worden verwerkt en uitsluitend worden gebruikt binnen deze masterproefstudie.</w:t>
+      </w:r>
+    </w:p>
+    <w:p>
+      <w:pPr>
+        <w:spacing w:after="60"/>
+        <w:ind w:left="170"/>
+      </w:pPr>
+      <w:r>
+        <w:rPr>
+          <w:sz w:val="20"/>
+        </w:rPr>
+        <w:t>□   Ik begrijp dat ik mij op elk moment kan terugtrekken door contact op te nemen met de onderzoeker.</w:t>
       </w:r>
     </w:p>
     <w:p/>
     <w:p>
       <w:r>
         <w:rPr>
+          <w:b/>
           <w:sz w:val="20"/>
         </w:rPr>
-        <w:t>Bezorg het ingevulde document terug via e-mail:</w:t>
+        <w:t>Terugbezorging:</w:t>
+      </w:r>
+    </w:p>
+    <w:p>
+      <w:r>
+        <w:rPr>
+          <w:sz w:val="20"/>
+        </w:rPr>
+        <w:t>Bezorg dit ingevulde document als bijlage via e-mail:</w:t>
         <w:br/>
-        <w:t>stijn.vanseveren@ugent.be  --  onderwerp: PHOENIX-PRE-HCP-PRE-01</w:t>
+        <w:t xml:space="preserve">  Aan:         stijn.vanseveren@ugent.be</w:t>
+        <w:br/>
+        <w:t xml:space="preserve">  Onderwerp:   PHOENIX-PRE-HCP-PRE-01</w:t>
+      </w:r>
+    </w:p>
+    <w:p/>
+    <w:p>
+      <w:pPr>
+        <w:shd w:val="clear" w:color="auto" w:fill="DBEAFE"/>
+      </w:pPr>
+      <w:r>
+        <w:rPr>
+          <w:sz w:val="20"/>
+        </w:rPr>
+        <w:t>VERTROUWELIJKHEID EN VERWERKING</w:t>
+        <w:br/>
+        <w:br/>
+        <w:t>Na ontvangst worden uw antwoorden geanonimiseerd en opgenomen in het expertreferentiecorpus voor de latere blind evaluatie van het PHOENIX-systeem. Uw gegevens worden op geen enkel moment gekoppeld aan uw naam of identiteit in publieke of wetenschappelijke rapportage.</w:t>
+        <w:br/>
+        <w:br/>
+        <w:t>Door dit document in te dienen bevestigt u vrijwillig in te stemmen met deelname aan deze studie. Uw inzending geldt als geïnformeerde toestemming (informed consent).</w:t>
+        <w:br/>
+        <w:br/>
+        <w:t>Hartelijk dank voor uw bijdrage aan dit onderzoek.</w:t>
       </w:r>
     </w:p>
     <w:sectPr>

</xml_diff>

<commit_message>
Fix Word doc title page: centered layout, complete info, informed consent
- Title page fully centered: title, deelnemerscode box, and studieinfo table
- Studieinfo table uses shaded two-column grid, centered on page
- Doel van deze bundel and Vertrouwelijkheid boxes fully written out
- Informed consent clause explicit: inzending = geïnformeerde toestemming
- Bold first-line headings on each shaded box for readability
- PDF: Prof. Dr. already fixed in previous commit

Co-Authored-By: Claude Sonnet 4.6 <noreply@anthropic.com>
</commit_message>
<xml_diff>
--- a/evaluation/qualtrics/01_HCPs_PRE/separate_HCPs/HCP_1/main.docx
+++ b/evaluation/qualtrics/01_HCPs_PRE/separate_HCPs/HCP_1/main.docx
@@ -10,10 +10,19 @@
         <w:rPr>
           <w:b/>
           <w:color w:val="1E3A5F"/>
-          <w:sz w:val="36"/>
+          <w:sz w:val="40"/>
         </w:rPr>
         <w:t>PHOENIX evaluatiestudie -- Fase 1</w:t>
+      </w:r>
+      <w:r>
         <w:br/>
+      </w:r>
+      <w:r>
+        <w:rPr>
+          <w:b/>
+          <w:color w:val="1D4ED8"/>
+          <w:sz w:val="28"/>
+        </w:rPr>
         <w:t>Instrument voor Zorgprofessionals</w:t>
       </w:r>
     </w:p>
@@ -21,16 +30,58 @@
     <w:p>
       <w:pPr>
         <w:jc w:val="center"/>
+        <w:shd w:val="clear" w:color="auto" w:fill="DBEAFE"/>
       </w:pPr>
       <w:r>
         <w:rPr>
           <w:b/>
-          <w:color w:val="1D4ED8"/>
-          <w:sz w:val="24"/>
+          <w:sz w:val="20"/>
         </w:rPr>
-        <w:t>Deelnemerscode: HCP-PRE-01</w:t>
+        <w:t>Deelnemerscode:  HCP-PRE-01</w:t>
+      </w:r>
+      <w:r>
         <w:br/>
-        <w:t>Toegewezen casussen: C01 (28-jarige softwareontwikkelaar)  en  C02 (34-jarige administratief medewerker in de zorg)</w:t>
+      </w:r>
+      <w:r>
+        <w:rPr>
+          <w:sz w:val="20"/>
+        </w:rPr>
+      </w:r>
+      <w:r>
+        <w:br/>
+      </w:r>
+      <w:r>
+        <w:rPr>
+          <w:sz w:val="20"/>
+        </w:rPr>
+        <w:t>Toegewezen casussen:</w:t>
+      </w:r>
+      <w:r>
+        <w:br/>
+      </w:r>
+      <w:r>
+        <w:rPr>
+          <w:sz w:val="20"/>
+        </w:rPr>
+        <w:t>C01  (28-jarige softwareontwikkelaar)</w:t>
+      </w:r>
+      <w:r>
+        <w:br/>
+      </w:r>
+      <w:r>
+        <w:rPr>
+          <w:sz w:val="20"/>
+        </w:rPr>
+        <w:t>en</w:t>
+      </w:r>
+      <w:r>
+        <w:br/>
+      </w:r>
+      <w:r>
+        <w:rPr>
+          <w:sz w:val="20"/>
+        </w:rPr>
+        <w:t>C02  (34-jarige administratief medewerker in de zorg)</w:t>
       </w:r>
     </w:p>
     <w:p/>
@@ -38,6 +89,7 @@
       <w:tblPr>
         <w:tblStyle w:val="TableGrid"/>
         <w:tblW w:type="auto" w:w="0"/>
+        <w:jc w:val="center"/>
         <w:tblLook w:firstColumn="1" w:firstRow="1" w:lastColumn="0" w:lastRow="0" w:noHBand="0" w:noVBand="1" w:val="04A0"/>
       </w:tblPr>
       <w:tblGrid>
@@ -47,7 +99,8 @@
       <w:tr>
         <w:tc>
           <w:tcPr>
-            <w:tcW w:type="dxa" w:w="2551"/>
+            <w:tcW w:type="dxa" w:w="2381"/>
+            <w:shd w:val="clear" w:color="auto" w:fill="DBEAFE"/>
           </w:tcPr>
           <w:p>
             <w:r>
@@ -61,7 +114,8 @@
         </w:tc>
         <w:tc>
           <w:tcPr>
-            <w:tcW w:type="dxa" w:w="4703"/>
+            <w:tcW w:type="dxa" w:w="5953"/>
+            <w:shd w:val="clear" w:color="auto" w:fill="F8FAFC"/>
           </w:tcPr>
           <w:p>
             <w:r>
@@ -76,7 +130,8 @@
       <w:tr>
         <w:tc>
           <w:tcPr>
-            <w:tcW w:type="dxa" w:w="2551"/>
+            <w:tcW w:type="dxa" w:w="2381"/>
+            <w:shd w:val="clear" w:color="auto" w:fill="DBEAFE"/>
           </w:tcPr>
           <w:p>
             <w:r>
@@ -90,7 +145,8 @@
         </w:tc>
         <w:tc>
           <w:tcPr>
-            <w:tcW w:type="dxa" w:w="4703"/>
+            <w:tcW w:type="dxa" w:w="5953"/>
+            <w:shd w:val="clear" w:color="auto" w:fill="F8FAFC"/>
           </w:tcPr>
           <w:p>
             <w:r>
@@ -105,7 +161,8 @@
       <w:tr>
         <w:tc>
           <w:tcPr>
-            <w:tcW w:type="dxa" w:w="2551"/>
+            <w:tcW w:type="dxa" w:w="2381"/>
+            <w:shd w:val="clear" w:color="auto" w:fill="DBEAFE"/>
           </w:tcPr>
           <w:p>
             <w:r>
@@ -119,7 +176,8 @@
         </w:tc>
         <w:tc>
           <w:tcPr>
-            <w:tcW w:type="dxa" w:w="4703"/>
+            <w:tcW w:type="dxa" w:w="5953"/>
+            <w:shd w:val="clear" w:color="auto" w:fill="F8FAFC"/>
           </w:tcPr>
           <w:p>
             <w:r>
@@ -134,7 +192,8 @@
       <w:tr>
         <w:tc>
           <w:tcPr>
-            <w:tcW w:type="dxa" w:w="2551"/>
+            <w:tcW w:type="dxa" w:w="2381"/>
+            <w:shd w:val="clear" w:color="auto" w:fill="DBEAFE"/>
           </w:tcPr>
           <w:p>
             <w:r>
@@ -148,7 +207,8 @@
         </w:tc>
         <w:tc>
           <w:tcPr>
-            <w:tcW w:type="dxa" w:w="4703"/>
+            <w:tcW w:type="dxa" w:w="5953"/>
+            <w:shd w:val="clear" w:color="auto" w:fill="F8FAFC"/>
           </w:tcPr>
           <w:p>
             <w:r>
@@ -163,7 +223,8 @@
       <w:tr>
         <w:tc>
           <w:tcPr>
-            <w:tcW w:type="dxa" w:w="2551"/>
+            <w:tcW w:type="dxa" w:w="2381"/>
+            <w:shd w:val="clear" w:color="auto" w:fill="DBEAFE"/>
           </w:tcPr>
           <w:p>
             <w:r>
@@ -177,7 +238,8 @@
         </w:tc>
         <w:tc>
           <w:tcPr>
-            <w:tcW w:type="dxa" w:w="4703"/>
+            <w:tcW w:type="dxa" w:w="5953"/>
+            <w:shd w:val="clear" w:color="auto" w:fill="F8FAFC"/>
           </w:tcPr>
           <w:p>
             <w:r>
@@ -192,7 +254,8 @@
       <w:tr>
         <w:tc>
           <w:tcPr>
-            <w:tcW w:type="dxa" w:w="2551"/>
+            <w:tcW w:type="dxa" w:w="2381"/>
+            <w:shd w:val="clear" w:color="auto" w:fill="DBEAFE"/>
           </w:tcPr>
           <w:p>
             <w:r>
@@ -206,7 +269,8 @@
         </w:tc>
         <w:tc>
           <w:tcPr>
-            <w:tcW w:type="dxa" w:w="4703"/>
+            <w:tcW w:type="dxa" w:w="5953"/>
+            <w:shd w:val="clear" w:color="auto" w:fill="F8FAFC"/>
           </w:tcPr>
           <w:p>
             <w:r>
@@ -222,51 +286,174 @@
     <w:p/>
     <w:p>
       <w:pPr>
-        <w:shd w:val="clear" w:color="auto" w:fill="DBEAFE"/>
+        <w:jc w:val="left"/>
+        <w:shd w:val="clear" w:color="auto" w:fill="EFF6FF"/>
       </w:pPr>
+      <w:r>
+        <w:rPr>
+          <w:b/>
+          <w:sz w:val="20"/>
+        </w:rPr>
+        <w:t>Doel van deze bundel</w:t>
+      </w:r>
+      <w:r>
+        <w:br/>
+      </w:r>
       <w:r>
         <w:rPr>
           <w:sz w:val="20"/>
         </w:rPr>
-        <w:t>DOEL VAN DEZE BUNDEL</w:t>
+      </w:r>
+      <w:r>
         <w:br/>
+      </w:r>
+      <w:r>
+        <w:rPr>
+          <w:sz w:val="20"/>
+        </w:rPr>
+        <w:t>U neemt deel aan een evaluatiestudie waarin zorgprofessionals onafhankelijk dezelfde vijf klinische redeneerstappen uitvoeren als het PHOENIX-systeem. Uw antwoorden vormen het menselijke referentiecorpus voor een latere dubbelblinde vergelijking met systeemoutput.</w:t>
+      </w:r>
+      <w:r>
         <w:br/>
-        <w:t>U neemt deel aan een evaluatiestudie waarin zorgprofessionals onafhankelijk dezelfde vijf klinische redeneerstappen uitvoeren als het PHOENIX-systeem. Uw antwoorden vormen het menselijke referentiecorpus voor een latere dubbelblinde vergelijking met systeemoutput.</w:t>
+      </w:r>
+      <w:r>
+        <w:rPr>
+          <w:sz w:val="20"/>
+        </w:rPr>
+      </w:r>
+      <w:r>
         <w:br/>
+      </w:r>
+      <w:r>
+        <w:rPr>
+          <w:sz w:val="20"/>
+        </w:rPr>
+        <w:t>Voor elk van uw twee casussen vult u dezelfde vijf delen in: (1) operationalisering, (2) initieel observatiemodel, (3) prioritering van behandeldoelen, (4) verfijning van EMA-metingen en (5) een mobiele coachingsboodschap.</w:t>
+      </w:r>
+      <w:r>
         <w:br/>
-        <w:t>Voor elk van uw twee casussen vult u dezelfde vijf delen in: (1) operationalisering, (2) initieel observatiemodel, (3) prioritering van behandeldoelen, (4) verfijning van EMA-metingen en (5) een mobiele coachingsboodschap.</w:t>
+      </w:r>
+      <w:r>
+        <w:rPr>
+          <w:sz w:val="20"/>
+        </w:rPr>
+      </w:r>
+      <w:r>
         <w:br/>
-        <w:br/>
+      </w:r>
+      <w:r>
+        <w:rPr>
+          <w:sz w:val="20"/>
+        </w:rPr>
         <w:t>We vragen uw eigen klinische oordeelsvorming. Antwoord zoals u dat in een reele professionele context zou doen, maar werk strikt volgens de instructies op de volgende pagina.</w:t>
       </w:r>
     </w:p>
     <w:p/>
     <w:p>
       <w:pPr>
+        <w:jc w:val="left"/>
         <w:shd w:val="clear" w:color="auto" w:fill="FEF3C7"/>
       </w:pPr>
+      <w:r>
+        <w:rPr>
+          <w:b/>
+          <w:sz w:val="20"/>
+        </w:rPr>
+        <w:t>Vertrouwelijkheid en geïnformeerde toestemming</w:t>
+      </w:r>
+      <w:r>
+        <w:br/>
+      </w:r>
       <w:r>
         <w:rPr>
           <w:sz w:val="20"/>
         </w:rPr>
-        <w:t>VERTROUWELIJKHEID EN GEÏNFORMEERDE TOESTEMMING</w:t>
+      </w:r>
+      <w:r>
         <w:br/>
+      </w:r>
+      <w:r>
+        <w:rPr>
+          <w:sz w:val="20"/>
+        </w:rPr>
+        <w:t>Uw antwoorden worden voor analyse geanonimiseerd en uitsluitend gebruikt binnen deze masterproefstudie. Na ontvangst worden ze opgenomen in het expertreferentiecorpus voor de latere blind evaluatie van het PHOENIX-systeem. Uw gegevens worden op geen enkel moment gekoppeld aan uw naam of identiteit in publieke of wetenschappelijke rapportage.</w:t>
+      </w:r>
+      <w:r>
         <w:br/>
-        <w:t>Uw antwoorden worden voor analyse geanonimiseerd en uitsluitend gebruikt binnen deze masterproefstudie. Na ontvangst worden ze opgenomen in het expertreferentiecorpus voor de latere blind evaluatie van het PHOENIX-systeem.</w:t>
+      </w:r>
+      <w:r>
+        <w:rPr>
+          <w:sz w:val="20"/>
+        </w:rPr>
+      </w:r>
+      <w:r>
         <w:br/>
+      </w:r>
+      <w:r>
+        <w:rPr>
+          <w:sz w:val="20"/>
+        </w:rPr>
+        <w:t>Deelname is volledig vrijwillig. U kan zich op elk moment zonder opgave van reden terugtrekken door contact op te nemen met de onderzoeker via stijn.vanseveren@ugent.be. Terugtrekking heeft geen gevolgen.</w:t>
+      </w:r>
+      <w:r>
         <w:br/>
-        <w:t>Deelname is volledig vrijwillig. U kan zich op elk moment zonder opgave van reden terugtrekken door contact op te nemen met de onderzoeker via stijn.vanseveren@ugent.be. Terugtrekking heeft geen gevolgen.</w:t>
+      </w:r>
+      <w:r>
+        <w:rPr>
+          <w:sz w:val="20"/>
+        </w:rPr>
+      </w:r>
+      <w:r>
         <w:br/>
+      </w:r>
+      <w:r>
+        <w:rPr>
+          <w:sz w:val="20"/>
+        </w:rPr>
+        <w:t>Door dit ingevulde document te bezorgen aan de onderzoeker bevestigt u dat:</w:t>
+      </w:r>
+      <w:r>
         <w:br/>
-        <w:t>Door dit ingevulde document te bezorgen aan de onderzoeker, bevestigt u dat:</w:t>
+      </w:r>
+      <w:r>
+        <w:rPr>
+          <w:sz w:val="20"/>
+        </w:rPr>
+        <w:t xml:space="preserve">  (1)  u de bovenstaande informatie hebt gelezen en begrepen;</w:t>
+      </w:r>
+      <w:r>
         <w:br/>
-        <w:t xml:space="preserve">  (1) u de bovenstaande informatie hebt gelezen en begrepen;</w:t>
+      </w:r>
+      <w:r>
+        <w:rPr>
+          <w:sz w:val="20"/>
+        </w:rPr>
+        <w:t xml:space="preserve">  (2)  u vrijwillig instemt met deelname aan deze studie;</w:t>
+      </w:r>
+      <w:r>
         <w:br/>
-        <w:t xml:space="preserve">  (2) u vrijwillig instemt met deelname aan deze studie;</w:t>
+      </w:r>
+      <w:r>
+        <w:rPr>
+          <w:sz w:val="20"/>
+        </w:rPr>
+        <w:t xml:space="preserve">  (3)  u begrijpt dat uw antwoorden geanonimiseerd worden verwerkt.</w:t>
+      </w:r>
+      <w:r>
         <w:br/>
-        <w:t xml:space="preserve">  (3) u begrijpt dat uw antwoorden geanonimiseerd worden verwerkt.</w:t>
+      </w:r>
+      <w:r>
+        <w:rPr>
+          <w:sz w:val="20"/>
+        </w:rPr>
+      </w:r>
+      <w:r>
         <w:br/>
-        <w:br/>
+      </w:r>
+      <w:r>
+        <w:rPr>
+          <w:sz w:val="20"/>
+        </w:rPr>
         <w:t>Uw inzending geldt als geïnformeerde toestemming.</w:t>
       </w:r>
     </w:p>
@@ -738,6 +925,7 @@
     <w:p/>
     <w:p>
       <w:pPr>
+        <w:jc w:val="left"/>
         <w:shd w:val="clear" w:color="auto" w:fill="FFF7ED"/>
       </w:pPr>
       <w:r>
@@ -745,21 +933,57 @@
           <w:sz w:val="20"/>
         </w:rPr>
         <w:t>WERKWIJZE -- STRIKT TE VOLGEN:</w:t>
+      </w:r>
+      <w:r>
         <w:br/>
+      </w:r>
+      <w:r>
+        <w:rPr>
+          <w:sz w:val="20"/>
+        </w:rPr>
         <w:t>1. Werk sequentieel: Deel 1 -&gt; Deel 5. Ga pas naar een volgend deel wanneer het huidige volledig is afgewerkt voor beide casussen.</w:t>
+      </w:r>
+      <w:r>
         <w:br/>
+      </w:r>
+      <w:r>
+        <w:rPr>
+          <w:sz w:val="20"/>
+        </w:rPr>
         <w:t>2. Gebruik geen generatieve AI, schrijfhulpmiddelen, richtlijnen of collegaoverleg. Extern gebruik ondermijnt de methodologische validiteit en de blind scoringswaarde van de studie.</w:t>
+      </w:r>
+      <w:r>
         <w:br/>
+      </w:r>
+      <w:r>
+        <w:rPr>
+          <w:sz w:val="20"/>
+        </w:rPr>
         <w:t>3. Gebruik in latere delen uitsluitend de meegeleverde gestandaardiseerde context. Die is bewust vastgezet zodat alle deelnemers op identieke input reageren.</w:t>
+      </w:r>
+      <w:r>
         <w:br/>
+      </w:r>
+      <w:r>
+        <w:rPr>
+          <w:sz w:val="20"/>
+        </w:rPr>
         <w:t>4. Herwerk eerdere antwoorden NIET retroactief nadat u latere context hebt gezien.</w:t>
+      </w:r>
+      <w:r>
         <w:br/>
+      </w:r>
+      <w:r>
+        <w:rPr>
+          <w:sz w:val="20"/>
+        </w:rPr>
         <w:t>5. Noteer of typ rechtstreeks in de voorziene antwoordzones. Onleesbare of ambigu geformuleerde antwoorden bemoeilijken latere blind beoordeling.</w:t>
       </w:r>
     </w:p>
     <w:p/>
     <w:p>
       <w:pPr>
+        <w:jc w:val="left"/>
         <w:shd w:val="clear" w:color="auto" w:fill="ECFDF5"/>
       </w:pPr>
       <w:r>
@@ -767,18 +991,67 @@
           <w:sz w:val="20"/>
         </w:rPr>
         <w:t>EMA-PRINCIPES (relevant voor Deel 2 en Deel 4):</w:t>
+      </w:r>
+      <w:r>
         <w:br/>
+      </w:r>
+      <w:r>
+        <w:rPr>
+          <w:sz w:val="20"/>
+        </w:rPr>
         <w:t>Ecological Momentary Assessment (EMA) meet dagelijkse schommelingen via een mobiele app. Elke EMA-variabele moet aan vier vereisten voldoen:</w:t>
+      </w:r>
+      <w:r>
         <w:br/>
+      </w:r>
+      <w:r>
+        <w:rPr>
+          <w:sz w:val="20"/>
+        </w:rPr>
         <w:t xml:space="preserve">  (1) Dagelijks rapporteerbaar via een korte smartphone-vraag.</w:t>
+      </w:r>
+      <w:r>
         <w:br/>
+      </w:r>
+      <w:r>
+        <w:rPr>
+          <w:sz w:val="20"/>
+        </w:rPr>
         <w:t xml:space="preserve">  (2) Dynamisch en veranderbaar -- geen vaste diagnose, trait of achtergrondkenmerk.</w:t>
+      </w:r>
+      <w:r>
         <w:br/>
+      </w:r>
+      <w:r>
+        <w:rPr>
+          <w:sz w:val="20"/>
+        </w:rPr>
         <w:t xml:space="preserve">  (3) Meetbaar in een eenvoudig format: ja/nee, aantal, minuten of een 0-10 score.</w:t>
+      </w:r>
+      <w:r>
         <w:br/>
+      </w:r>
+      <w:r>
+        <w:rPr>
+          <w:sz w:val="20"/>
+        </w:rPr>
         <w:t xml:space="preserve">  (4) Klinisch relevant voor opvolging -- toont binnen-persoonsvariatie die therapeutisch informatief is.</w:t>
+      </w:r>
+      <w:r>
         <w:br/>
+      </w:r>
+      <w:r>
+        <w:rPr>
+          <w:sz w:val="20"/>
+        </w:rPr>
+      </w:r>
+      <w:r>
         <w:br/>
+      </w:r>
+      <w:r>
+        <w:rPr>
+          <w:sz w:val="20"/>
+        </w:rPr>
         <w:t>In Deel 2 genereert u zelf predictorlabels. In Deel 4 zijn de 20 kandidaat-items reeds uitgewerkt als dagelijkse EMA-items; u selecteert de meest geschikte 5.</w:t>
       </w:r>
     </w:p>
@@ -798,6 +1071,7 @@
     </w:p>
     <w:p>
       <w:pPr>
+        <w:jc w:val="left"/>
         <w:shd w:val="clear" w:color="auto" w:fill="DBEAFE"/>
       </w:pPr>
       <w:r>
@@ -823,6 +1097,7 @@
     </w:p>
     <w:p>
       <w:pPr>
+        <w:jc w:val="left"/>
         <w:shd w:val="clear" w:color="auto" w:fill="EFF6FF"/>
       </w:pPr>
       <w:r>
@@ -830,8 +1105,22 @@
           <w:sz w:val="20"/>
         </w:rPr>
         <w:t>CASUSVIGNET  |  Duur: 2 maanden</w:t>
+      </w:r>
+      <w:r>
         <w:br/>
+      </w:r>
+      <w:r>
+        <w:rPr>
+          <w:sz w:val="20"/>
+        </w:rPr>
+      </w:r>
+      <w:r>
         <w:br/>
+      </w:r>
+      <w:r>
+        <w:rPr>
+          <w:sz w:val="20"/>
+        </w:rPr>
         <w:t>``De afgelopen twee maanden geraak ik 's avonds heel moeilijk in slaap. Mijn hoofd blijft maar doorgaan over alles wat ik nog moet doen -- deadlines, onafgewerkte taken, gesprekken die ik nog moet voeren. Zelfs als ik uitgeput ben, krijg ik die gedachten niet uitgezet. Ik merk ook dat ik minder plezier beleef aan sociale momenten. Ik ga nog wel naar afspraken met vrienden, maar ik voel me er afstandelijk en niet echt betrokken. Mijn nek en schouders staan bovendien bijna voortdurend gespannen en pijnlijk, wat volgens mijn huisarts waarschijnlijk stressgerelateerd is.''</w:t>
       </w:r>
     </w:p>
@@ -957,6 +1246,7 @@
     </w:p>
     <w:p>
       <w:pPr>
+        <w:jc w:val="left"/>
         <w:shd w:val="clear" w:color="auto" w:fill="EFF6FF"/>
       </w:pPr>
       <w:r>
@@ -964,8 +1254,22 @@
           <w:sz w:val="20"/>
         </w:rPr>
         <w:t>CASUSVIGNET  |  Duur: 3 maanden</w:t>
+      </w:r>
+      <w:r>
         <w:br/>
+      </w:r>
+      <w:r>
+        <w:rPr>
+          <w:sz w:val="20"/>
+        </w:rPr>
+      </w:r>
+      <w:r>
         <w:br/>
+      </w:r>
+      <w:r>
+        <w:rPr>
+          <w:sz w:val="20"/>
+        </w:rPr>
         <w:t>``Ongeveer drie maanden geleden begon ik plots episodes te krijgen waarbij mijn hart tekeergaat, ik het gevoel heb dat ik geen lucht krijg en ik er zeker van ben dat er iets ernstig misloopt. Die episodes zijn heel beangstigend en kunnen zelfs optreden wanneer ik thuis rustig neerzit. Sindsdien ben ik bang geworden om zo'n episode in het openbaar te krijgen en vermijd ik supermarkten, openbaar vervoer en drukke plaatsen. Ik heb mij al meerdere keren ziek gemeld omdat ik bang was dat het op het werk zou gebeuren. Ik weet rationeel dat die situaties niet gevaarlijk zijn, maar de angst blijft overheersen.''</w:t>
       </w:r>
     </w:p>
@@ -1091,6 +1395,7 @@
     </w:p>
     <w:p>
       <w:pPr>
+        <w:jc w:val="left"/>
         <w:shd w:val="clear" w:color="auto" w:fill="D1FAE5"/>
       </w:pPr>
       <w:r>
@@ -1116,6 +1421,7 @@
     </w:p>
     <w:p>
       <w:pPr>
+        <w:jc w:val="left"/>
         <w:shd w:val="clear" w:color="auto" w:fill="EFF6FF"/>
       </w:pPr>
       <w:r>
@@ -1123,7 +1429,14 @@
           <w:sz w:val="20"/>
         </w:rPr>
         <w:t>Casus C01: verkorte klachtomschrijving</w:t>
+      </w:r>
+      <w:r>
         <w:br/>
+      </w:r>
+      <w:r>
+        <w:rPr>
+          <w:sz w:val="20"/>
+        </w:rPr>
         <w:t>28-jarige softwareontwikkelaar; duur: 2 maanden. Inslaapproblemen, cognitieve hyperarousal bij het slapengaan, sociale anhedonie en stressgerelateerde spierspanning.</w:t>
       </w:r>
     </w:p>
@@ -1287,6 +1600,7 @@
     </w:p>
     <w:p>
       <w:pPr>
+        <w:jc w:val="left"/>
         <w:shd w:val="clear" w:color="auto" w:fill="EFF6FF"/>
       </w:pPr>
       <w:r>
@@ -1294,7 +1608,14 @@
           <w:sz w:val="20"/>
         </w:rPr>
         <w:t>Casus C02: verkorte klachtomschrijving</w:t>
+      </w:r>
+      <w:r>
         <w:br/>
+      </w:r>
+      <w:r>
+        <w:rPr>
+          <w:sz w:val="20"/>
+        </w:rPr>
         <w:t>34-jarige administratief medewerker in de zorg; duur: 3 maanden. Recidiverende paniekepisoden, anticipatieangst, situationele vermijding en beroepsmatige interferentie.</w:t>
       </w:r>
     </w:p>
@@ -1458,6 +1779,7 @@
     </w:p>
     <w:p>
       <w:pPr>
+        <w:jc w:val="left"/>
         <w:shd w:val="clear" w:color="auto" w:fill="FEF3C7"/>
       </w:pPr>
       <w:r>
@@ -1483,6 +1805,7 @@
     </w:p>
     <w:p>
       <w:pPr>
+        <w:jc w:val="left"/>
         <w:shd w:val="clear" w:color="auto" w:fill="EFF6FF"/>
       </w:pPr>
       <w:r>
@@ -1490,7 +1813,14 @@
           <w:sz w:val="20"/>
         </w:rPr>
         <w:t>Casus C01: 28-jarige softwareontwikkelaar</w:t>
+      </w:r>
+      <w:r>
         <w:br/>
+      </w:r>
+      <w:r>
+        <w:rPr>
+          <w:sz w:val="20"/>
+        </w:rPr>
         <w:t>Inslaapproblemen, cognitieve hyperarousal bij het slapengaan, sociale anhedonie en stressgerelateerde spierspanning.  Duur: 2 maanden.</w:t>
       </w:r>
     </w:p>
@@ -1666,6 +1996,7 @@
     </w:p>
     <w:p>
       <w:pPr>
+        <w:jc w:val="left"/>
         <w:shd w:val="clear" w:color="auto" w:fill="EFF6FF"/>
       </w:pPr>
       <w:r>
@@ -1673,7 +2004,14 @@
           <w:sz w:val="20"/>
         </w:rPr>
         <w:t>Casus C02: 34-jarige administratief medewerker in de zorg</w:t>
+      </w:r>
+      <w:r>
         <w:br/>
+      </w:r>
+      <w:r>
+        <w:rPr>
+          <w:sz w:val="20"/>
+        </w:rPr>
         <w:t>Recidiverende paniekepisoden, anticipatieangst, situationele vermijding en beroepsmatige interferentie.  Duur: 3 maanden.</w:t>
       </w:r>
     </w:p>
@@ -1849,6 +2187,7 @@
     </w:p>
     <w:p>
       <w:pPr>
+        <w:jc w:val="left"/>
         <w:shd w:val="clear" w:color="auto" w:fill="EDE9FE"/>
       </w:pPr>
       <w:r>
@@ -2550,6 +2889,7 @@
     </w:p>
     <w:p>
       <w:pPr>
+        <w:jc w:val="left"/>
         <w:shd w:val="clear" w:color="auto" w:fill="FFF0F0"/>
       </w:pPr>
       <w:r>
@@ -2557,10 +2897,31 @@
           <w:sz w:val="20"/>
         </w:rPr>
         <w:t>Schrijf een korte, patientgerichte coachingsboodschap die rechtstreeks in de mobiele applicatie kan verschijnen. Gebruik het primaire probleem, het behandeldoel, de voornaamste barriere en de aangegeven copingstrategie. De boodschap moet compact, warm en professioneel zijn en een concrete eerste stap bevatten.</w:t>
+      </w:r>
+      <w:r>
         <w:br/>
+      </w:r>
+      <w:r>
+        <w:rPr>
+          <w:sz w:val="20"/>
+        </w:rPr>
+      </w:r>
+      <w:r>
         <w:br/>
+      </w:r>
+      <w:r>
+        <w:rPr>
+          <w:sz w:val="20"/>
+        </w:rPr>
         <w:t>Werkvoorbeeld (niet gerelateerd aan een studiecasus):</w:t>
+      </w:r>
+      <w:r>
         <w:br/>
+      </w:r>
+      <w:r>
+        <w:rPr>
+          <w:sz w:val="20"/>
+        </w:rPr>
         <w:t>"Na een zware shift voelt rust nemen logisch, maar net dat eerste kleine beweegmoment kan je avond helpen ontladen. Trek vanavond meteen na thuiskomst je schoenen aan en wandel 10 minuten buiten -- dat ene blokje. Zo maak je de stap haalbaar."</w:t>
       </w:r>
     </w:p>
@@ -3173,6 +3534,7 @@
     <w:p/>
     <w:p>
       <w:pPr>
+        <w:jc w:val="left"/>
         <w:shd w:val="clear" w:color="auto" w:fill="DBEAFE"/>
       </w:pPr>
       <w:r>
@@ -3180,14 +3542,56 @@
           <w:sz w:val="20"/>
         </w:rPr>
         <w:t>VERTROUWELIJKHEID EN VERWERKING</w:t>
+      </w:r>
+      <w:r>
         <w:br/>
+      </w:r>
+      <w:r>
+        <w:rPr>
+          <w:sz w:val="20"/>
+        </w:rPr>
+      </w:r>
+      <w:r>
         <w:br/>
+      </w:r>
+      <w:r>
+        <w:rPr>
+          <w:sz w:val="20"/>
+        </w:rPr>
         <w:t>Na ontvangst worden uw antwoorden geanonimiseerd en opgenomen in het expertreferentiecorpus voor de latere blind evaluatie van het PHOENIX-systeem. Uw gegevens worden op geen enkel moment gekoppeld aan uw naam of identiteit in publieke of wetenschappelijke rapportage.</w:t>
+      </w:r>
+      <w:r>
         <w:br/>
+      </w:r>
+      <w:r>
+        <w:rPr>
+          <w:sz w:val="20"/>
+        </w:rPr>
+      </w:r>
+      <w:r>
         <w:br/>
+      </w:r>
+      <w:r>
+        <w:rPr>
+          <w:sz w:val="20"/>
+        </w:rPr>
         <w:t>Door dit document in te dienen bevestigt u vrijwillig in te stemmen met deelname aan deze studie. Uw inzending geldt als geïnformeerde toestemming (informed consent).</w:t>
+      </w:r>
+      <w:r>
         <w:br/>
+      </w:r>
+      <w:r>
+        <w:rPr>
+          <w:sz w:val="20"/>
+        </w:rPr>
+      </w:r>
+      <w:r>
         <w:br/>
+      </w:r>
+      <w:r>
+        <w:rPr>
+          <w:sz w:val="20"/>
+        </w:rPr>
         <w:t>Hartelijk dank voor uw bijdrage aan dit onderzoek.</w:t>
       </w:r>
     </w:p>

</xml_diff>

<commit_message>
Rebuild HCP bipartite networks: predictors left, criteria right, proportional edge weights
- Flip layout in all 10 cases: prnode at x=0 (left), crnode at x=9 (right)
- Replace categorical S/M edge styles with real float weights (-1 to 1)
  based on case-by-case clinical patterns; line width = |w| * 2.5 pt
- Red edges = risk factors (positive weight), blue = protective (negative)
- Update legend in PART3_HEADER to explain sign + proportional thickness
- Update Word doc network text with numeric weights and direction arrows
- Save all edge weights to evaluation/qualtrics/01_HCPs_PRE/bipartite_edge_weights.json
</commit_message>
<xml_diff>
--- a/evaluation/qualtrics/01_HCPs_PRE/separate_HCPs/HCP_1/main.docx
+++ b/evaluation/qualtrics/01_HCPs_PRE/separate_HCPs/HCP_1/main.docx
@@ -1786,7 +1786,7 @@
         <w:rPr>
           <w:sz w:val="20"/>
         </w:rPr>
-        <w:t>Rangschik de 5 standaardpredictoren van hoogste naar laagste klinische prioriteit als behandeldoel. Gebruik hiervoor de 21-daagse monitoring en het bipartiet netwerk (rood = sterke relatie, blauw = matige relatie). Zie de bijgevoegde PDF voor het kleurrijke netwerkdiagram.</w:t>
+        <w:t>Rangschik de 5 standaardpredictoren van hoogste naar laagste klinische prioriteit als behandeldoel. Gebruik hiervoor de 21-daagse monitoring en het bipartiet netwerk (rood = risicofactor, blauw = beschermend, lijndikte ∝ |gewicht|). Zie de bijgevoegde PDF voor het visuele netwerkdiagram met predictoren links en criteria rechts.</w:t>
       </w:r>
     </w:p>
     <w:p>
@@ -1846,7 +1846,7 @@
           <w:b/>
           <w:sz w:val="20"/>
         </w:rPr>
-        <w:t>Bipartiet netwerk (zie PDF voor visuele weergave):</w:t>
+        <w:t>Bipartiet netwerk — predictoren (links) → criteria (rechts)  (zie PDF voor visuele weergave):</w:t>
       </w:r>
     </w:p>
     <w:p>
@@ -1856,13 +1856,13 @@
           <w:color w:val="B91C1C"/>
           <w:sz w:val="18"/>
         </w:rPr>
-        <w:t xml:space="preserve">  Sterke relaties (rood):  </w:t>
+        <w:t xml:space="preserve">  Risicofactoren (rood, positief gewicht):  </w:t>
       </w:r>
       <w:r>
         <w:rPr>
           <w:sz w:val="18"/>
         </w:rPr>
-        <w:t>CR-1 (Inslaapproblemen) &lt;-&gt; P1 (Late avondschermtijd),  CR-2 (Cognitieve hyperarousal) &lt;-&gt; P1 (Late avondschermtijd),  CR-2 (Cognitieve hyperarousal) &lt;-&gt; P3 (Preslaap cognitieve offloading),  CR-3 (Sociale anhedonie) &lt;-&gt; P4 (Sociale participatie)</w:t>
+        <w:t>P1 (Late avondschermtijd) → CR-1 (Inslaapproblemen) (w=+0.82),  P1 (Late avondschermtijd) → CR-2 (Cognitieve hyperarousal) (w=+0.78),  P2 (Dagelijkse taakaccumulatie) → CR-2 (Cognitieve hyperarousal) (w=+0.55)</w:t>
       </w:r>
     </w:p>
     <w:p>
@@ -1872,13 +1872,13 @@
           <w:color w:val="1D4ED8"/>
           <w:sz w:val="18"/>
         </w:rPr>
-        <w:t xml:space="preserve">  Matige relaties (blauw):  </w:t>
+        <w:t xml:space="preserve">  Beschermende factoren (blauw, negatief gewicht):  </w:t>
       </w:r>
       <w:r>
         <w:rPr>
           <w:sz w:val="18"/>
         </w:rPr>
-        <w:t>CR-2 (Cognitieve hyperarousal) &lt;-&gt; P2 (Dagelijkse taakaccumulatie),  CR-1 (Inslaapproblemen) &lt;-&gt; P3 (Preslaap cognitieve offloading),  CR-1 (Inslaapproblemen) &lt;-&gt; P5 (Aerobe beweging),  CR-4 (Stressgerelateerde spierspanning) &lt;-&gt; P5 (Aerobe beweging)</w:t>
+        <w:t>P3 (Preslaap cognitieve offloading) → CR-2 (Cognitieve hyperarousal) (w=-0.76),  P3 (Preslaap cognitieve offloading) → CR-1 (Inslaapproblemen) (w=-0.52),  P4 (Sociale participatie) → CR-3 (Sociale anhedonie) (w=-0.82),  P5 (Aerobe beweging) → CR-1 (Inslaapproblemen) (w=-0.55),  P5 (Aerobe beweging) → CR-4 (Stressgerelateerde spierspanning) (w=-0.62)</w:t>
       </w:r>
     </w:p>
     <w:p/>
@@ -2037,7 +2037,7 @@
           <w:b/>
           <w:sz w:val="20"/>
         </w:rPr>
-        <w:t>Bipartiet netwerk (zie PDF voor visuele weergave):</w:t>
+        <w:t>Bipartiet netwerk — predictoren (links) → criteria (rechts)  (zie PDF voor visuele weergave):</w:t>
       </w:r>
     </w:p>
     <w:p>
@@ -2047,13 +2047,13 @@
           <w:color w:val="B91C1C"/>
           <w:sz w:val="18"/>
         </w:rPr>
-        <w:t xml:space="preserve">  Sterke relaties (rood):  </w:t>
+        <w:t xml:space="preserve">  Risicofactoren (rood, positief gewicht):  </w:t>
       </w:r>
       <w:r>
         <w:rPr>
           <w:sz w:val="18"/>
         </w:rPr>
-        <w:t>CR-3 (Situationele vermijding) &lt;-&gt; P1 (Vermijdingsgedrag),  CR-2 (Anticipatieangst) &lt;-&gt; P1 (Vermijdingsgedrag),  CR-2 (Anticipatieangst) &lt;-&gt; P2 (Veiligheidsgedrag),  CR-2 (Anticipatieangst) &lt;-&gt; P3 (Interoceptieve focus),  CR-1 (Recidiverende paniekepisoden) &lt;-&gt; P3 (Interoceptieve focus),  CR-3 (Situationele vermijding) &lt;-&gt; P4 (Geplande exposure)</w:t>
+        <w:t>P1 (Vermijdingsgedrag) → CR-3 (Situationele vermijding) (w=+0.85),  P1 (Vermijdingsgedrag) → CR-2 (Anticipatieangst) (w=+0.80),  P2 (Veiligheidsgedrag) → CR-2 (Anticipatieangst) (w=+0.75),  P2 (Veiligheidsgedrag) → CR-1 (Recidiverende paniekepisoden) (w=+0.55),  P3 (Interoceptieve focus) → CR-2 (Anticipatieangst) (w=+0.78),  P3 (Interoceptieve focus) → CR-1 (Recidiverende paniekepisoden) (w=+0.72)</w:t>
       </w:r>
     </w:p>
     <w:p>
@@ -2063,13 +2063,13 @@
           <w:color w:val="1D4ED8"/>
           <w:sz w:val="18"/>
         </w:rPr>
-        <w:t xml:space="preserve">  Matige relaties (blauw):  </w:t>
+        <w:t xml:space="preserve">  Beschermende factoren (blauw, negatief gewicht):  </w:t>
       </w:r>
       <w:r>
         <w:rPr>
           <w:sz w:val="18"/>
         </w:rPr>
-        <w:t>CR-1 (Recidiverende paniekepisoden) &lt;-&gt; P2 (Veiligheidsgedrag),  CR-4 (Beroepsmatige interferentie) &lt;-&gt; P5 (Dagstructuur)</w:t>
+        <w:t>P4 (Geplande exposure) → CR-3 (Situationele vermijding) (w=-0.80),  P5 (Dagstructuur) → CR-4 (Beroepsmatige interferentie) (w=-0.52)</w:t>
       </w:r>
     </w:p>
     <w:p/>

</xml_diff>

<commit_message>
Relabel cases as Casus 1/2 per HCP bundle in all PDFs and Word docs
Each HCP only sees 2 cases; all section headings, complaintbox titles,
completion page, and Word doc now say "Casus 1" and "Casus 2" instead
of the global C01–C10 identifiers, making the scope of the task clear.
</commit_message>
<xml_diff>
--- a/evaluation/qualtrics/01_HCPs_PRE/separate_HCPs/HCP_1/main.docx
+++ b/evaluation/qualtrics/01_HCPs_PRE/separate_HCPs/HCP_1/main.docx
@@ -63,7 +63,7 @@
         <w:rPr>
           <w:sz w:val="20"/>
         </w:rPr>
-        <w:t>C01  (28-jarige softwareontwikkelaar)</w:t>
+        <w:t>Casus 1  (28-jarige softwareontwikkelaar)</w:t>
       </w:r>
       <w:r>
         <w:br/>
@@ -81,7 +81,7 @@
         <w:rPr>
           <w:sz w:val="20"/>
         </w:rPr>
-        <w:t>C02  (34-jarige administratief medewerker in de zorg)</w:t>
+        <w:t>Casus 2  (34-jarige administratief medewerker in de zorg)</w:t>
       </w:r>
     </w:p>
     <w:p/>
@@ -1092,7 +1092,7 @@
         <w:jc w:val="left"/>
       </w:pPr>
       <w:r>
-        <w:t>Casus C01: 28-jarige softwareontwikkelaar</w:t>
+        <w:t>Casus 1: 28-jarige softwareontwikkelaar</w:t>
       </w:r>
     </w:p>
     <w:p>
@@ -1241,7 +1241,7 @@
         <w:jc w:val="left"/>
       </w:pPr>
       <w:r>
-        <w:t>Casus C02: 34-jarige administratief medewerker in de zorg</w:t>
+        <w:t>Casus 2: 34-jarige administratief medewerker in de zorg</w:t>
       </w:r>
     </w:p>
     <w:p>
@@ -1416,7 +1416,7 @@
         <w:jc w:val="left"/>
       </w:pPr>
       <w:r>
-        <w:t>Casus C01: Deel 2</w:t>
+        <w:t>Casus 1: Deel 2</w:t>
       </w:r>
     </w:p>
     <w:p>
@@ -1428,7 +1428,7 @@
         <w:rPr>
           <w:sz w:val="20"/>
         </w:rPr>
-        <w:t>Casus C01: verkorte klachtomschrijving</w:t>
+        <w:t>Casus 1: verkorte klachtomschrijving</w:t>
       </w:r>
       <w:r>
         <w:br/>
@@ -1595,7 +1595,7 @@
         <w:jc w:val="left"/>
       </w:pPr>
       <w:r>
-        <w:t>Casus C02: Deel 2</w:t>
+        <w:t>Casus 2: Deel 2</w:t>
       </w:r>
     </w:p>
     <w:p>
@@ -1607,7 +1607,7 @@
         <w:rPr>
           <w:sz w:val="20"/>
         </w:rPr>
-        <w:t>Casus C02: verkorte klachtomschrijving</w:t>
+        <w:t>Casus 2: verkorte klachtomschrijving</w:t>
       </w:r>
       <w:r>
         <w:br/>
@@ -1800,7 +1800,7 @@
         <w:jc w:val="left"/>
       </w:pPr>
       <w:r>
-        <w:t>Casus C01: Deel 3</w:t>
+        <w:t>Casus 1: Deel 3</w:t>
       </w:r>
     </w:p>
     <w:p>
@@ -1812,7 +1812,7 @@
         <w:rPr>
           <w:sz w:val="20"/>
         </w:rPr>
-        <w:t>Casus C01: 28-jarige softwareontwikkelaar</w:t>
+        <w:t>Casus 1: 28-jarige softwareontwikkelaar</w:t>
       </w:r>
       <w:r>
         <w:br/>
@@ -1991,7 +1991,7 @@
         <w:jc w:val="left"/>
       </w:pPr>
       <w:r>
-        <w:t>Casus C02: Deel 3</w:t>
+        <w:t>Casus 2: Deel 3</w:t>
       </w:r>
     </w:p>
     <w:p>
@@ -2003,7 +2003,7 @@
         <w:rPr>
           <w:sz w:val="20"/>
         </w:rPr>
-        <w:t>Casus C02: 34-jarige administratief medewerker in de zorg</w:t>
+        <w:t>Casus 2: 34-jarige administratief medewerker in de zorg</w:t>
       </w:r>
       <w:r>
         <w:br/>
@@ -2208,7 +2208,7 @@
         <w:jc w:val="left"/>
       </w:pPr>
       <w:r>
-        <w:t>Casus C01: Deel 4</w:t>
+        <w:t>Casus 1: Deel 4</w:t>
       </w:r>
     </w:p>
     <w:p>
@@ -2546,7 +2546,7 @@
         <w:jc w:val="left"/>
       </w:pPr>
       <w:r>
-        <w:t>Casus C02: Deel 4</w:t>
+        <w:t>Casus 2: Deel 4</w:t>
       </w:r>
     </w:p>
     <w:p>
@@ -2936,7 +2936,7 @@
         <w:jc w:val="left"/>
       </w:pPr>
       <w:r>
-        <w:t>Casus C01: Deel 5</w:t>
+        <w:t>Casus 1: Deel 5</w:t>
       </w:r>
     </w:p>
     <w:tbl>
@@ -3164,7 +3164,7 @@
         <w:jc w:val="left"/>
       </w:pPr>
       <w:r>
-        <w:t>Casus C02: Deel 5</w:t>
+        <w:t>Casus 2: Deel 5</w:t>
       </w:r>
     </w:p>
     <w:tbl>
@@ -3400,7 +3400,7 @@
         <w:rPr>
           <w:sz w:val="20"/>
         </w:rPr>
-        <w:t>Dank u voor het invullen van alle vijf delen voor uw twee toegewezen casussen (C01 en C02).</w:t>
+        <w:t>Dank u voor het invullen van alle vijf delen voor uw twee toegewezen casussen (Casus 1 en Casus 2).</w:t>
       </w:r>
     </w:p>
     <w:p/>
@@ -3422,7 +3422,7 @@
         <w:rPr>
           <w:sz w:val="20"/>
         </w:rPr>
-        <w:t>□   Ik heb in Deel 1 voor beide casussen (C01 en C02) criteriumlabels ingevuld.</w:t>
+        <w:t>□   Ik heb in Deel 1 voor beide casussen (Casus 1 en Casus 2) criteriumlabels ingevuld.</w:t>
       </w:r>
     </w:p>
     <w:p>

</xml_diff>

<commit_message>
Fix HCP PRE bundles: case profile in all section headers, better bipartite networks, legend
- Remove \u00a0 non-breaking space from Casus local_label (caused rendering artefact)
- All Deel 2–5 subsection titles now include the case profile, e.g.
  'Casus 1: 28-jarige softwareontwikkelaar -- Deel 2' in both PDF and Word
- Bipartite network edge widths now min-max normalised within each network
  (range 1–5 pt instead of flat 1.3–2.1 pt) for clearly visible variation
- Embedded legend in every bipartite network figure:
  red = risk factor (positive weight), blue = protective (negative weight)
- Regenerated all 5 HCP bundles (tex + pdf + docx)
- Rewrote total/README.md: full case table, Qualtrics setup, network legend
  explanation, relation to separate bundles

Co-Authored-By: Claude Sonnet 4.6 <noreply@anthropic.com>
</commit_message>
<xml_diff>
--- a/evaluation/qualtrics/01_HCPs_PRE/separate_HCPs/HCP_1/main.docx
+++ b/evaluation/qualtrics/01_HCPs_PRE/separate_HCPs/HCP_1/main.docx
@@ -1092,7 +1092,7 @@
         <w:jc w:val="left"/>
       </w:pPr>
       <w:r>
-        <w:t>Casus 1: 28-jarige softwareontwikkelaar</w:t>
+        <w:t>Casus 1: 28-jarige softwareontwikkelaar</w:t>
       </w:r>
     </w:p>
     <w:p>
@@ -1241,7 +1241,7 @@
         <w:jc w:val="left"/>
       </w:pPr>
       <w:r>
-        <w:t>Casus 2: 34-jarige administratief medewerker in de zorg</w:t>
+        <w:t>Casus 2: 34-jarige administratief medewerker in de zorg</w:t>
       </w:r>
     </w:p>
     <w:p>
@@ -1416,7 +1416,7 @@
         <w:jc w:val="left"/>
       </w:pPr>
       <w:r>
-        <w:t>Casus 1: Deel 2</w:t>
+        <w:t>Casus 1: 28-jarige softwareontwikkelaar -- Deel 2</w:t>
       </w:r>
     </w:p>
     <w:p>
@@ -1428,7 +1428,7 @@
         <w:rPr>
           <w:sz w:val="20"/>
         </w:rPr>
-        <w:t>Casus 1: verkorte klachtomschrijving</w:t>
+        <w:t>Casus 1: verkorte klachtomschrijving</w:t>
       </w:r>
       <w:r>
         <w:br/>
@@ -1595,7 +1595,7 @@
         <w:jc w:val="left"/>
       </w:pPr>
       <w:r>
-        <w:t>Casus 2: Deel 2</w:t>
+        <w:t>Casus 2: 34-jarige administratief medewerker in de zorg -- Deel 2</w:t>
       </w:r>
     </w:p>
     <w:p>
@@ -1607,7 +1607,7 @@
         <w:rPr>
           <w:sz w:val="20"/>
         </w:rPr>
-        <w:t>Casus 2: verkorte klachtomschrijving</w:t>
+        <w:t>Casus 2: verkorte klachtomschrijving</w:t>
       </w:r>
       <w:r>
         <w:br/>
@@ -1800,7 +1800,7 @@
         <w:jc w:val="left"/>
       </w:pPr>
       <w:r>
-        <w:t>Casus 1: Deel 3</w:t>
+        <w:t>Casus 1: 28-jarige softwareontwikkelaar -- Deel 3</w:t>
       </w:r>
     </w:p>
     <w:p>
@@ -1812,7 +1812,7 @@
         <w:rPr>
           <w:sz w:val="20"/>
         </w:rPr>
-        <w:t>Casus 1: 28-jarige softwareontwikkelaar</w:t>
+        <w:t>Casus 1: 28-jarige softwareontwikkelaar</w:t>
       </w:r>
       <w:r>
         <w:br/>
@@ -1991,7 +1991,7 @@
         <w:jc w:val="left"/>
       </w:pPr>
       <w:r>
-        <w:t>Casus 2: Deel 3</w:t>
+        <w:t>Casus 2: 34-jarige administratief medewerker in de zorg -- Deel 3</w:t>
       </w:r>
     </w:p>
     <w:p>
@@ -2003,7 +2003,7 @@
         <w:rPr>
           <w:sz w:val="20"/>
         </w:rPr>
-        <w:t>Casus 2: 34-jarige administratief medewerker in de zorg</w:t>
+        <w:t>Casus 2: 34-jarige administratief medewerker in de zorg</w:t>
       </w:r>
       <w:r>
         <w:br/>
@@ -2208,7 +2208,7 @@
         <w:jc w:val="left"/>
       </w:pPr>
       <w:r>
-        <w:t>Casus 1: Deel 4</w:t>
+        <w:t>Casus 1: 28-jarige softwareontwikkelaar -- Deel 4</w:t>
       </w:r>
     </w:p>
     <w:p>
@@ -2546,7 +2546,7 @@
         <w:jc w:val="left"/>
       </w:pPr>
       <w:r>
-        <w:t>Casus 2: Deel 4</w:t>
+        <w:t>Casus 2: 34-jarige administratief medewerker in de zorg -- Deel 4</w:t>
       </w:r>
     </w:p>
     <w:p>
@@ -2936,7 +2936,7 @@
         <w:jc w:val="left"/>
       </w:pPr>
       <w:r>
-        <w:t>Casus 1: Deel 5</w:t>
+        <w:t>Casus 1: 28-jarige softwareontwikkelaar -- Deel 5</w:t>
       </w:r>
     </w:p>
     <w:tbl>
@@ -3164,7 +3164,7 @@
         <w:jc w:val="left"/>
       </w:pPr>
       <w:r>
-        <w:t>Casus 2: Deel 5</w:t>
+        <w:t>Casus 2: 34-jarige administratief medewerker in de zorg -- Deel 5</w:t>
       </w:r>
     </w:p>
     <w:tbl>

</xml_diff>

<commit_message>
Fix legend overlap, embed network figures in Word, refresh total PDF
- Bipartite network legend now uses 3 stacked rows (no side-by-side overlap):
  row 1: red line + 'Rood = risicofactor (positief verband: ...)'
  row 2: blue line + 'Blauw = beschermend (negatief verband: ...)'
  row 3: italic note on normalised line thickness
- Word documents (.docx) now contain actual bipartite network figures
  rendered via matplotlib (PNG embedded at 160 dpi, 5.8" wide) instead of
  the previous text-only edge list; docx grows from ~45 KB to ~195-214 KB
- Recompiled total/main.pdf with tectonic (all 10 cases × 5 parts confirmed)

Co-Authored-By: Claude Sonnet 4.6 <noreply@anthropic.com>
</commit_message>
<xml_diff>
--- a/evaluation/qualtrics/01_HCPs_PRE/separate_HCPs/HCP_1/main.docx
+++ b/evaluation/qualtrics/01_HCPs_PRE/separate_HCPs/HCP_1/main.docx
@@ -1786,7 +1786,7 @@
         <w:rPr>
           <w:sz w:val="20"/>
         </w:rPr>
-        <w:t>Rangschik de 5 standaardpredictoren van hoogste naar laagste klinische prioriteit als behandeldoel. Gebruik hiervoor de 21-daagse monitoring en het bipartiet netwerk (rood = risicofactor, blauw = beschermend, lijndikte ∝ |gewicht|). Zie de bijgevoegde PDF voor het visuele netwerkdiagram met predictoren links en criteria rechts.</w:t>
+        <w:t>Rangschik de 5 standaardpredictoren van hoogste naar laagste klinische prioriteit als behandeldoel. Gebruik hiervoor de 21-daagse monitoring en het bipartiet netwerk (rood = risicofactor, blauw = beschermend, lijndikte ∝ |gewicht|, genormaliseerd binnen elk netwerk).</w:t>
       </w:r>
     </w:p>
     <w:p>
@@ -1846,39 +1846,46 @@
           <w:b/>
           <w:sz w:val="20"/>
         </w:rPr>
-        <w:t>Bipartiet netwerk — predictoren (links) → criteria (rechts)  (zie PDF voor visuele weergave):</w:t>
+        <w:t>Bipartiet netwerk — predictoren (links) → criteria (rechts):</w:t>
       </w:r>
     </w:p>
     <w:p>
-      <w:r>
-        <w:rPr>
-          <w:b/>
-          <w:color w:val="B91C1C"/>
-          <w:sz w:val="18"/>
-        </w:rPr>
-        <w:t xml:space="preserve">  Risicofactoren (rood, positief gewicht):  </w:t>
-      </w:r>
-      <w:r>
-        <w:rPr>
-          <w:sz w:val="18"/>
-        </w:rPr>
-        <w:t>P1 (Late avondschermtijd) → CR-1 (Inslaapproblemen) (w=+0.82),  P1 (Late avondschermtijd) → CR-2 (Cognitieve hyperarousal) (w=+0.78),  P2 (Dagelijkse taakaccumulatie) → CR-2 (Cognitieve hyperarousal) (w=+0.55)</w:t>
-      </w:r>
-    </w:p>
-    <w:p>
-      <w:r>
-        <w:rPr>
-          <w:b/>
-          <w:color w:val="1D4ED8"/>
-          <w:sz w:val="18"/>
-        </w:rPr>
-        <w:t xml:space="preserve">  Beschermende factoren (blauw, negatief gewicht):  </w:t>
-      </w:r>
-      <w:r>
-        <w:rPr>
-          <w:sz w:val="18"/>
-        </w:rPr>
-        <w:t>P3 (Preslaap cognitieve offloading) → CR-2 (Cognitieve hyperarousal) (w=-0.76),  P3 (Preslaap cognitieve offloading) → CR-1 (Inslaapproblemen) (w=-0.52),  P4 (Sociale participatie) → CR-3 (Sociale anhedonie) (w=-0.82),  P5 (Aerobe beweging) → CR-1 (Inslaapproblemen) (w=-0.55),  P5 (Aerobe beweging) → CR-4 (Stressgerelateerde spierspanning) (w=-0.62)</w:t>
+      <w:pPr>
+        <w:jc w:val="center"/>
+      </w:pPr>
+      <w:r>
+        <w:drawing>
+          <wp:inline xmlns:a="http://schemas.openxmlformats.org/drawingml/2006/main" xmlns:pic="http://schemas.openxmlformats.org/drawingml/2006/picture">
+            <wp:extent cx="5303520" cy="3749826"/>
+            <wp:docPr id="1" name="Picture 1"/>
+            <wp:cNvGraphicFramePr>
+              <a:graphicFrameLocks noChangeAspect="1"/>
+            </wp:cNvGraphicFramePr>
+            <a:graphic>
+              <a:graphicData uri="http://schemas.openxmlformats.org/drawingml/2006/picture">
+                <pic:pic>
+                  <pic:nvPicPr>
+                    <pic:cNvPr id="0" name="image.png"/>
+                    <pic:cNvPicPr/>
+                  </pic:nvPicPr>
+                  <pic:blipFill>
+                    <a:blip r:embed="rId9"/>
+                    <a:stretch>
+                      <a:fillRect/>
+                    </a:stretch>
+                  </pic:blipFill>
+                  <pic:spPr>
+                    <a:xfrm>
+                      <a:off x="0" y="0"/>
+                      <a:ext cx="5303520" cy="3749826"/>
+                    </a:xfrm>
+                    <a:prstGeom prst="rect"/>
+                  </pic:spPr>
+                </pic:pic>
+              </a:graphicData>
+            </a:graphic>
+          </wp:inline>
+        </w:drawing>
       </w:r>
     </w:p>
     <w:p/>
@@ -2037,39 +2044,46 @@
           <w:b/>
           <w:sz w:val="20"/>
         </w:rPr>
-        <w:t>Bipartiet netwerk — predictoren (links) → criteria (rechts)  (zie PDF voor visuele weergave):</w:t>
+        <w:t>Bipartiet netwerk — predictoren (links) → criteria (rechts):</w:t>
       </w:r>
     </w:p>
     <w:p>
-      <w:r>
-        <w:rPr>
-          <w:b/>
-          <w:color w:val="B91C1C"/>
-          <w:sz w:val="18"/>
-        </w:rPr>
-        <w:t xml:space="preserve">  Risicofactoren (rood, positief gewicht):  </w:t>
-      </w:r>
-      <w:r>
-        <w:rPr>
-          <w:sz w:val="18"/>
-        </w:rPr>
-        <w:t>P1 (Vermijdingsgedrag) → CR-3 (Situationele vermijding) (w=+0.85),  P1 (Vermijdingsgedrag) → CR-2 (Anticipatieangst) (w=+0.80),  P2 (Veiligheidsgedrag) → CR-2 (Anticipatieangst) (w=+0.75),  P2 (Veiligheidsgedrag) → CR-1 (Recidiverende paniekepisoden) (w=+0.55),  P3 (Interoceptieve focus) → CR-2 (Anticipatieangst) (w=+0.78),  P3 (Interoceptieve focus) → CR-1 (Recidiverende paniekepisoden) (w=+0.72)</w:t>
-      </w:r>
-    </w:p>
-    <w:p>
-      <w:r>
-        <w:rPr>
-          <w:b/>
-          <w:color w:val="1D4ED8"/>
-          <w:sz w:val="18"/>
-        </w:rPr>
-        <w:t xml:space="preserve">  Beschermende factoren (blauw, negatief gewicht):  </w:t>
-      </w:r>
-      <w:r>
-        <w:rPr>
-          <w:sz w:val="18"/>
-        </w:rPr>
-        <w:t>P4 (Geplande exposure) → CR-3 (Situationele vermijding) (w=-0.80),  P5 (Dagstructuur) → CR-4 (Beroepsmatige interferentie) (w=-0.52)</w:t>
+      <w:pPr>
+        <w:jc w:val="center"/>
+      </w:pPr>
+      <w:r>
+        <w:drawing>
+          <wp:inline xmlns:a="http://schemas.openxmlformats.org/drawingml/2006/main" xmlns:pic="http://schemas.openxmlformats.org/drawingml/2006/picture">
+            <wp:extent cx="5303520" cy="3746607"/>
+            <wp:docPr id="2" name="Picture 2"/>
+            <wp:cNvGraphicFramePr>
+              <a:graphicFrameLocks noChangeAspect="1"/>
+            </wp:cNvGraphicFramePr>
+            <a:graphic>
+              <a:graphicData uri="http://schemas.openxmlformats.org/drawingml/2006/picture">
+                <pic:pic>
+                  <pic:nvPicPr>
+                    <pic:cNvPr id="0" name="image.png"/>
+                    <pic:cNvPicPr/>
+                  </pic:nvPicPr>
+                  <pic:blipFill>
+                    <a:blip r:embed="rId10"/>
+                    <a:stretch>
+                      <a:fillRect/>
+                    </a:stretch>
+                  </pic:blipFill>
+                  <pic:spPr>
+                    <a:xfrm>
+                      <a:off x="0" y="0"/>
+                      <a:ext cx="5303520" cy="3746607"/>
+                    </a:xfrm>
+                    <a:prstGeom prst="rect"/>
+                  </pic:spPr>
+                </pic:pic>
+              </a:graphicData>
+            </a:graphic>
+          </wp:inline>
+        </w:drawing>
       </w:r>
     </w:p>
     <w:p/>

</xml_diff>

<commit_message>
Fix legend colour semantics and improve Word network figure layout
Colour semantics corrected throughout (PDF + Word):
  - Blauw (blue) = positief verband (predictor vergroot criterium)
  - Rood (red)   = negatief verband (predictor verkleint criterium)

PDF (TikZ): edge colour assignment and all three legend rows updated

Word (matplotlib):
  - Full redesign of draw_network_png: light BG, outer border, column
    headers, split label/id text per node for readability, manual
    legend rows with matching colours, italic thickness note
  - word_part3_case: caption uses keep_with_next, proper space_before/
    after, image width reduced to 5.6" to avoid margin clipping

Stale 'rood = risicofactor' description text in Deel 3 section header
updated to match new semantics.

Co-Authored-By: Claude Sonnet 4.6 <noreply@anthropic.com>
</commit_message>
<xml_diff>
--- a/evaluation/qualtrics/01_HCPs_PRE/separate_HCPs/HCP_1/main.docx
+++ b/evaluation/qualtrics/01_HCPs_PRE/separate_HCPs/HCP_1/main.docx
@@ -1786,7 +1786,7 @@
         <w:rPr>
           <w:sz w:val="20"/>
         </w:rPr>
-        <w:t>Rangschik de 5 standaardpredictoren van hoogste naar laagste klinische prioriteit als behandeldoel. Gebruik hiervoor de 21-daagse monitoring en het bipartiet netwerk (rood = risicofactor, blauw = beschermend, lijndikte ∝ |gewicht|, genormaliseerd binnen elk netwerk).</w:t>
+        <w:t>Rangschik de 5 standaardpredictoren van hoogste naar laagste klinische prioriteit als behandeldoel. Gebruik hiervoor de 21-daagse monitoring en het bipartiet netwerk (blauw = positief verband, rood = negatief verband; lijndikte ∝ |w|, genormaliseerd binnen elk netwerk).</w:t>
       </w:r>
     </w:p>
     <w:p>
@@ -1841,22 +1841,28 @@
     </w:p>
     <w:p/>
     <w:p>
+      <w:pPr>
+        <w:keepNext/>
+        <w:spacing w:before="120" w:after="40"/>
+      </w:pPr>
       <w:r>
         <w:rPr>
           <w:b/>
+          <w:color w:val="1E3A5F"/>
           <w:sz w:val="20"/>
         </w:rPr>
-        <w:t>Bipartiet netwerk — predictoren (links) → criteria (rechts):</w:t>
+        <w:t>Bipartiet netwerk — predictoren (links) → criteria (rechts)</w:t>
       </w:r>
     </w:p>
     <w:p>
       <w:pPr>
+        <w:spacing w:before="0" w:after="120"/>
         <w:jc w:val="center"/>
       </w:pPr>
       <w:r>
         <w:drawing>
           <wp:inline xmlns:a="http://schemas.openxmlformats.org/drawingml/2006/main" xmlns:pic="http://schemas.openxmlformats.org/drawingml/2006/picture">
-            <wp:extent cx="5303520" cy="3749826"/>
+            <wp:extent cx="5120640" cy="3652165"/>
             <wp:docPr id="1" name="Picture 1"/>
             <wp:cNvGraphicFramePr>
               <a:graphicFrameLocks noChangeAspect="1"/>
@@ -1877,7 +1883,7 @@
                   <pic:spPr>
                     <a:xfrm>
                       <a:off x="0" y="0"/>
-                      <a:ext cx="5303520" cy="3749826"/>
+                      <a:ext cx="5120640" cy="3652165"/>
                     </a:xfrm>
                     <a:prstGeom prst="rect"/>
                   </pic:spPr>
@@ -2039,22 +2045,28 @@
     </w:p>
     <w:p/>
     <w:p>
+      <w:pPr>
+        <w:keepNext/>
+        <w:spacing w:before="120" w:after="40"/>
+      </w:pPr>
       <w:r>
         <w:rPr>
           <w:b/>
+          <w:color w:val="1E3A5F"/>
           <w:sz w:val="20"/>
         </w:rPr>
-        <w:t>Bipartiet netwerk — predictoren (links) → criteria (rechts):</w:t>
+        <w:t>Bipartiet netwerk — predictoren (links) → criteria (rechts)</w:t>
       </w:r>
     </w:p>
     <w:p>
       <w:pPr>
+        <w:spacing w:before="0" w:after="120"/>
         <w:jc w:val="center"/>
       </w:pPr>
       <w:r>
         <w:drawing>
           <wp:inline xmlns:a="http://schemas.openxmlformats.org/drawingml/2006/main" xmlns:pic="http://schemas.openxmlformats.org/drawingml/2006/picture">
-            <wp:extent cx="5303520" cy="3746607"/>
+            <wp:extent cx="5120640" cy="3657600"/>
             <wp:docPr id="2" name="Picture 2"/>
             <wp:cNvGraphicFramePr>
               <a:graphicFrameLocks noChangeAspect="1"/>
@@ -2075,7 +2087,7 @@
                   <pic:spPr>
                     <a:xfrm>
                       <a:off x="0" y="0"/>
-                      <a:ext cx="5303520" cy="3746607"/>
+                      <a:ext cx="5120640" cy="3657600"/>
                     </a:xfrm>
                     <a:prstGeom prst="rect"/>
                   </pic:spPr>

</xml_diff>

<commit_message>
Part 4 redesign: 6 items (2 sub-predictors × 3 targets) across all 10 cases
- C10: new bfs_items list with proper sub-predictors for Werkontkoppeling voor
  slaap, Avondlijk alcoholgebruik, and Stressregulatie overdag at positions
  2, 4, 7, 10, 13, 16; 14 distractors that are not sub-predictors of any target
- C01–C09: already updated in previous session
- Validation: bfs_correct length assert 5 → 6
- All instruction text updated: PART4_HEADER, part4_case(), word_part4_case(),
  Word shaded header, checklist lines, time-estimates table (LaTeX + Word)
- All 5 HCP PDFs and .docx regenerated

Co-Authored-By: Claude Sonnet 4.6 <noreply@anthropic.com>
</commit_message>
<xml_diff>
--- a/evaluation/qualtrics/01_HCPs_PRE/separate_HCPs/HCP_1/main.docx
+++ b/evaluation/qualtrics/01_HCPs_PRE/separate_HCPs/HCP_1/main.docx
@@ -847,7 +847,7 @@
               <w:rPr>
                 <w:sz w:val="18"/>
               </w:rPr>
-              <w:t>Selecteer exact 5 EMA-items uit de lijst van 20</w:t>
+              <w:t>Selecteer exact 6 EMA-items uit de lijst van 20</w:t>
             </w:r>
           </w:p>
         </w:tc>
@@ -2220,7 +2220,7 @@
         <w:rPr>
           <w:sz w:val="20"/>
         </w:rPr>
-        <w:t>Selecteer per casus EXACT 5 EMA-items uit een lijst van 20. Start vanuit de gestandaardiseerde behandeldoelen en kies de 5 dagelijkse EMA-items die daar het best op aansluiten als directe subpredictoren. Verkies klinisch relevante breedte boven irrelevante of perifere items.</w:t>
+        <w:t>Selecteer per casus EXACT 6 EMA-items uit een lijst van 20: 2 sub-predictoren per behandeldoel (3 x 2 = 6). Start vanuit de gestandaardiseerde behandeldoelen en kies per behandeldoel 2 dagelijkse EMA-items die daar het best op aansluiten als directe subpredictoren. Verkies klinisch relevante breedte boven irrelevante of perifere items.</w:t>
       </w:r>
     </w:p>
     <w:p>
@@ -2307,7 +2307,7 @@
           <w:b/>
           <w:sz w:val="20"/>
         </w:rPr>
-        <w:t>Opdracht: selecteer EXACT 5 EMA-items die het best passen als volgende subpredictoren. Vink de 5 geselecteerde items aan.</w:t>
+        <w:t>Opdracht: selecteer EXACT 6 EMA-items (2 per behandeldoel) die het best passen als volgende subpredictoren. Vink de 6 geselecteerde items aan.</w:t>
       </w:r>
     </w:p>
     <w:p/>
@@ -2332,7 +2332,7 @@
         <w:rPr>
           <w:sz w:val="20"/>
         </w:rPr>
-        <w:t xml:space="preserve"> 2.  □  Schermtijd na 22:00 uur (min)</w:t>
+        <w:t xml:space="preserve"> 2.  □  Smartphone-/tabletgebruik in bed na 22.00 uur (min)</w:t>
       </w:r>
     </w:p>
     <w:p>
@@ -2344,7 +2344,7 @@
         <w:rPr>
           <w:sz w:val="20"/>
         </w:rPr>
-        <w:t xml:space="preserve"> 3.  □  Aantal dutjes overdag (min)</w:t>
+        <w:t xml:space="preserve"> 3.  □  Slaapduur afgelopen nacht (uren)</w:t>
       </w:r>
     </w:p>
     <w:p>
@@ -2356,7 +2356,7 @@
         <w:rPr>
           <w:sz w:val="20"/>
         </w:rPr>
-        <w:t xml:space="preserve"> 4.  □  Preslaap cognitieve offloading toegepast (ja/nee)</w:t>
+        <w:t xml:space="preserve"> 4.  □  Nek- en schouderspanning in de avond (0--10)</w:t>
       </w:r>
     </w:p>
     <w:p>
@@ -2368,7 +2368,7 @@
         <w:rPr>
           <w:sz w:val="20"/>
         </w:rPr>
-        <w:t xml:space="preserve"> 5.  □  Tijd in bed voor het opstaan (min)</w:t>
+        <w:t xml:space="preserve"> 5.  □  Scherm als laatste activiteit voor het slapengaan (ja/nee)</w:t>
       </w:r>
     </w:p>
     <w:p>
@@ -2380,7 +2380,7 @@
         <w:rPr>
           <w:sz w:val="20"/>
         </w:rPr>
-        <w:t xml:space="preserve"> 6.  □  Aerobe beweging vandaag (min)</w:t>
+        <w:t xml:space="preserve"> 6.  □  Werkuren vandaag (uren)</w:t>
       </w:r>
     </w:p>
     <w:p>
@@ -2392,7 +2392,7 @@
         <w:rPr>
           <w:sz w:val="20"/>
         </w:rPr>
-        <w:t xml:space="preserve"> 7.  □  Aantal sociale afspraken gepland (aantal)</w:t>
+        <w:t xml:space="preserve"> 7.  □  Ochtendlichtblootstelling (min)</w:t>
       </w:r>
     </w:p>
     <w:p>
@@ -2404,7 +2404,7 @@
         <w:rPr>
           <w:sz w:val="20"/>
         </w:rPr>
-        <w:t xml:space="preserve"> 8.  □  Nek- en schouderspanning in de namiddag (0--10)</w:t>
+        <w:t xml:space="preserve"> 8.  □  Onafgewerkte taken opgeschreven voor het slapengaan (ja/nee)</w:t>
       </w:r>
     </w:p>
     <w:p>
@@ -2416,7 +2416,7 @@
         <w:rPr>
           <w:sz w:val="20"/>
         </w:rPr>
-        <w:t xml:space="preserve"> 9.  □  Blootstelling aan blauw licht voor het slapengaan (min)</w:t>
+        <w:t xml:space="preserve"> 9.  □  Alcoholinname in de avond (aantal)</w:t>
       </w:r>
     </w:p>
     <w:p>
@@ -2428,7 +2428,7 @@
         <w:rPr>
           <w:sz w:val="20"/>
         </w:rPr>
-        <w:t>10.  □  Piekeren over sociale afwijzing (0--10)</w:t>
+        <w:t>10.  □  Piekeren over sociale contacten (0--10)</w:t>
       </w:r>
     </w:p>
     <w:p>
@@ -2440,7 +2440,7 @@
         <w:rPr>
           <w:sz w:val="20"/>
         </w:rPr>
-        <w:t>11.  □  Aantal maaltijden na 21.00 uur (aantal)</w:t>
+        <w:t>11.  □  Kort dagboekmoment voor het slapengaan (min)</w:t>
       </w:r>
     </w:p>
     <w:p>
@@ -2452,7 +2452,7 @@
         <w:rPr>
           <w:sz w:val="20"/>
         </w:rPr>
-        <w:t>12.  □  Ochtendlichtblootstelling (min)</w:t>
+        <w:t>12.  □  Waterinname vandaag (glazen)</w:t>
       </w:r>
     </w:p>
     <w:p>
@@ -2464,7 +2464,7 @@
         <w:rPr>
           <w:sz w:val="20"/>
         </w:rPr>
-        <w:t>13.  □  Preslaap ontspanningsritueel uitgevoerd (ja/nee)</w:t>
+        <w:t>13.  □  Concentratie overdag (0--10)</w:t>
       </w:r>
     </w:p>
     <w:p>
@@ -2476,7 +2476,7 @@
         <w:rPr>
           <w:sz w:val="20"/>
         </w:rPr>
-        <w:t>14.  □  Werkuren vandaag (uren)</w:t>
+        <w:t>14.  □  Stappentelling overdag (stappen)</w:t>
       </w:r>
     </w:p>
     <w:p>
@@ -2488,7 +2488,7 @@
         <w:rPr>
           <w:sz w:val="20"/>
         </w:rPr>
-        <w:t>15.  □  Alcoholinname in de avond (aantal)</w:t>
+        <w:t>15.  □  Sociaal contact vandaag geinitieerd (ja/nee)</w:t>
       </w:r>
     </w:p>
     <w:p>
@@ -2500,7 +2500,7 @@
         <w:rPr>
           <w:sz w:val="20"/>
         </w:rPr>
-        <w:t>16.  □  Slaapduur afgelopen nacht (uren)</w:t>
+        <w:t>16.  □  Middagdutje genomen (ja/nee)</w:t>
       </w:r>
     </w:p>
     <w:p>
@@ -2512,7 +2512,7 @@
         <w:rPr>
           <w:sz w:val="20"/>
         </w:rPr>
-        <w:t>17.  □  Aantal onbeantwoorde berichten (aantal)</w:t>
+        <w:t>17.  □  Duur matige tot intensieve sportactiviteit vandaag (min)</w:t>
       </w:r>
     </w:p>
     <w:p>
@@ -2524,7 +2524,7 @@
         <w:rPr>
           <w:sz w:val="20"/>
         </w:rPr>
-        <w:t>18.  □  Pijnintensiteit lage rug (0--10)</w:t>
+        <w:t>18.  □  Spierspanning lage rug (0--10)</w:t>
       </w:r>
     </w:p>
     <w:p>
@@ -2536,7 +2536,7 @@
         <w:rPr>
           <w:sz w:val="20"/>
         </w:rPr>
-        <w:t>19.  □  Hydratatie vandaag (glazen)</w:t>
+        <w:t>19.  □  Inslaapduur gisteren (min)</w:t>
       </w:r>
     </w:p>
     <w:p>
@@ -2548,7 +2548,7 @@
         <w:rPr>
           <w:sz w:val="20"/>
         </w:rPr>
-        <w:t>20.  □  Concentratie overdag (0--10)</w:t>
+        <w:t>20.  □  Eetlust bij avondmaal (0--10)</w:t>
       </w:r>
     </w:p>
     <w:p/>
@@ -2558,7 +2558,7 @@
           <w:b/>
           <w:sz w:val="20"/>
         </w:rPr>
-        <w:t>Totaal geselecteerd: _____ / 5</w:t>
+        <w:t>Totaal geselecteerd: _____ / 6</w:t>
       </w:r>
     </w:p>
     <w:p>
@@ -2645,7 +2645,7 @@
           <w:b/>
           <w:sz w:val="20"/>
         </w:rPr>
-        <w:t>Opdracht: selecteer EXACT 5 EMA-items die het best passen als volgende subpredictoren. Vink de 5 geselecteerde items aan.</w:t>
+        <w:t>Opdracht: selecteer EXACT 6 EMA-items (2 per behandeldoel) die het best passen als volgende subpredictoren. Vink de 6 geselecteerde items aan.</w:t>
       </w:r>
     </w:p>
     <w:p/>
@@ -2658,7 +2658,7 @@
         <w:rPr>
           <w:sz w:val="20"/>
         </w:rPr>
-        <w:t xml:space="preserve"> 1.  □  Cafeine-inname voor 12.00 uur (aantal)</w:t>
+        <w:t xml:space="preserve"> 1.  □  Exposurestap uit hierarchie uitgevoerd (ja/nee)</w:t>
       </w:r>
     </w:p>
     <w:p>
@@ -2670,7 +2670,7 @@
         <w:rPr>
           <w:sz w:val="20"/>
         </w:rPr>
-        <w:t xml:space="preserve"> 2.  □  Geplande exposure-oefening uitgevoerd (ja/nee)</w:t>
+        <w:t xml:space="preserve"> 2.  □  Cafeine-inname voor 12.00 uur (aantal)</w:t>
       </w:r>
     </w:p>
     <w:p>
@@ -2694,7 +2694,7 @@
         <w:rPr>
           <w:sz w:val="20"/>
         </w:rPr>
-        <w:t xml:space="preserve"> 4.  □  Spierspanning in schouders (0--10)</w:t>
+        <w:t xml:space="preserve"> 4.  □  Duur verblijf in vermeden situatie (min)</w:t>
       </w:r>
     </w:p>
     <w:p>
@@ -2706,7 +2706,7 @@
         <w:rPr>
           <w:sz w:val="20"/>
         </w:rPr>
-        <w:t xml:space="preserve"> 5.  □  Veiligheidsgedrag frequentie (0--10)</w:t>
+        <w:t xml:space="preserve"> 5.  □  Spierspanning in schouders (0--10)</w:t>
       </w:r>
     </w:p>
     <w:p>
@@ -2730,7 +2730,7 @@
         <w:rPr>
           <w:sz w:val="20"/>
         </w:rPr>
-        <w:t xml:space="preserve"> 7.  □  Lichamelijke sensaties zonder reactie geobserveerd (min)</w:t>
+        <w:t xml:space="preserve"> 7.  □  Concrete veiligheidsactie bewust nagelaten (ja/nee)</w:t>
       </w:r>
     </w:p>
     <w:p>
@@ -2766,7 +2766,7 @@
         <w:rPr>
           <w:sz w:val="20"/>
         </w:rPr>
-        <w:t>10.  □  Vermijdingssituatie betreden ondanks angst (ja/nee)</w:t>
+        <w:t>10.  □  Aantal vermijdingshandelingen ingeperkt vandaag (aantal)</w:t>
       </w:r>
     </w:p>
     <w:p>
@@ -2802,7 +2802,7 @@
         <w:rPr>
           <w:sz w:val="20"/>
         </w:rPr>
-        <w:t>13.  □  Aantal dutjes overdag (min)</w:t>
+        <w:t>13.  □  Lichamelijke sensaties bewust geobserveerd zonder te handelen (min)</w:t>
       </w:r>
     </w:p>
     <w:p>
@@ -2814,7 +2814,7 @@
         <w:rPr>
           <w:sz w:val="20"/>
         </w:rPr>
-        <w:t>14.  □  Eetlust vandaag (0--10)</w:t>
+        <w:t>14.  □  Aantal dutjes overdag (min)</w:t>
       </w:r>
     </w:p>
     <w:p>
@@ -2826,7 +2826,7 @@
         <w:rPr>
           <w:sz w:val="20"/>
         </w:rPr>
-        <w:t>15.  □  Anticipatieangst voor gevreesde situatie (0--10)</w:t>
+        <w:t>15.  □  Eetlust vandaag (0--10)</w:t>
       </w:r>
     </w:p>
     <w:p>
@@ -2850,7 +2850,7 @@
         <w:rPr>
           <w:sz w:val="20"/>
         </w:rPr>
-        <w:t>17.  □  Stapelteller vandaag (aantal)</w:t>
+        <w:t>17.  □  Aandacht bewust van lichaamssensaties afgeleid (ja/nee)</w:t>
       </w:r>
     </w:p>
     <w:p>
@@ -2862,7 +2862,7 @@
         <w:rPr>
           <w:sz w:val="20"/>
         </w:rPr>
-        <w:t>18.  □  Concentratie tijdens administratie (0--10)</w:t>
+        <w:t>18.  □  Stapelteller vandaag (aantal)</w:t>
       </w:r>
     </w:p>
     <w:p>
@@ -2874,7 +2874,7 @@
         <w:rPr>
           <w:sz w:val="20"/>
         </w:rPr>
-        <w:t>19.  □  Alcoholinname vanavond (aantal)</w:t>
+        <w:t>19.  □  Concentratie tijdens administratie (0--10)</w:t>
       </w:r>
     </w:p>
     <w:p>
@@ -2886,7 +2886,7 @@
         <w:rPr>
           <w:sz w:val="20"/>
         </w:rPr>
-        <w:t>20.  □  Dagplanning bijgehouden (ja/nee)</w:t>
+        <w:t>20.  □  Alcoholinname vanavond (aantal)</w:t>
       </w:r>
     </w:p>
     <w:p/>
@@ -2896,7 +2896,7 @@
           <w:b/>
           <w:sz w:val="20"/>
         </w:rPr>
-        <w:t>Totaal geselecteerd: _____ / 5</w:t>
+        <w:t>Totaal geselecteerd: _____ / 6</w:t>
       </w:r>
     </w:p>
     <w:p>
@@ -3484,7 +3484,7 @@
         <w:rPr>
           <w:sz w:val="20"/>
         </w:rPr>
-        <w:t>□   Ik heb in Deel 4 voor beide casussen exact 5 EMA-items geselecteerd.</w:t>
+        <w:t>□   Ik heb in Deel 4 voor beide casussen exact 6 EMA-items geselecteerd.</w:t>
       </w:r>
     </w:p>
     <w:p>

</xml_diff>

<commit_message>
Revise PRE survey content: pure predictor bfs_items + strengthened instructions
- Replace all criterion-type bfs_items (0-10 symptom ratings, outcome measures)
  with predictor-type EMA behaviours across all 10 cases (C01-C10)
- Fix unclear 'exposurestap uit hierarchie' label in C02 to
  'Geplande exposurestap bewust en volledig uitgevoerd vandaag'
- Rewrite INTRO and Part 1-5 headers in generator with explicit
  criterion vs predictor definitions, EMA principles, bipartite
  network reading guide, BFS sub-predictor concept, and HAPA phases
- Update English main.tex Part 1-5 instruction boxes with matching
  clinical definitions, examples of valid vs invalid items, and
  clearer task framing for HCPs
- Regenerate all 5 HCP PDFs and DOCX files

Co-Authored-By: Claude Sonnet 4.6 <noreply@anthropic.com>
</commit_message>
<xml_diff>
--- a/evaluation/qualtrics/01_HCPs_PRE/separate_HCPs/HCP_1/main.docx
+++ b/evaluation/qualtrics/01_HCPs_PRE/separate_HCPs/HCP_1/main.docx
@@ -2332,7 +2332,7 @@
         <w:rPr>
           <w:sz w:val="20"/>
         </w:rPr>
-        <w:t xml:space="preserve"> 2.  □  Smartphone-/tabletgebruik in bed na 22.00 uur (min)</w:t>
+        <w:t xml:space="preserve"> 2.  □  Smartphone- of tabletgebruik na 22.00 uur (min)</w:t>
       </w:r>
     </w:p>
     <w:p>
@@ -2344,7 +2344,7 @@
         <w:rPr>
           <w:sz w:val="20"/>
         </w:rPr>
-        <w:t xml:space="preserve"> 3.  □  Slaapduur afgelopen nacht (uren)</w:t>
+        <w:t xml:space="preserve"> 3.  □  Consistent slaaptijdstip aangehouden (ja/nee)</w:t>
       </w:r>
     </w:p>
     <w:p>
@@ -2356,7 +2356,7 @@
         <w:rPr>
           <w:sz w:val="20"/>
         </w:rPr>
-        <w:t xml:space="preserve"> 4.  □  Nek- en schouderspanning in de avond (0--10)</w:t>
+        <w:t xml:space="preserve"> 4.  □  Korte stretching of ademhalingsoefening in avond uitgevoerd (min)</w:t>
       </w:r>
     </w:p>
     <w:p>
@@ -2368,7 +2368,7 @@
         <w:rPr>
           <w:sz w:val="20"/>
         </w:rPr>
-        <w:t xml:space="preserve"> 5.  □  Scherm als laatste activiteit voor het slapengaan (ja/nee)</w:t>
+        <w:t xml:space="preserve"> 5.  □  Schermvrij interval direct voor slapengaan (min)</w:t>
       </w:r>
     </w:p>
     <w:p>
@@ -2392,7 +2392,7 @@
         <w:rPr>
           <w:sz w:val="20"/>
         </w:rPr>
-        <w:t xml:space="preserve"> 7.  □  Ochtendlichtblootstelling (min)</w:t>
+        <w:t xml:space="preserve"> 7.  □  Ochtendlichtblootstelling of buitengaan in de ochtend (min)</w:t>
       </w:r>
     </w:p>
     <w:p>
@@ -2404,7 +2404,7 @@
         <w:rPr>
           <w:sz w:val="20"/>
         </w:rPr>
-        <w:t xml:space="preserve"> 8.  □  Onafgewerkte taken opgeschreven voor het slapengaan (ja/nee)</w:t>
+        <w:t xml:space="preserve"> 8.  □  Openstaande taken schriftelijk genoteerd voor het slapengaan (ja/nee)</w:t>
       </w:r>
     </w:p>
     <w:p>
@@ -2416,7 +2416,7 @@
         <w:rPr>
           <w:sz w:val="20"/>
         </w:rPr>
-        <w:t xml:space="preserve"> 9.  □  Alcoholinname in de avond (aantal)</w:t>
+        <w:t xml:space="preserve"> 9.  □  Alcoholinname vanavond (eenheden)</w:t>
       </w:r>
     </w:p>
     <w:p>
@@ -2428,7 +2428,7 @@
         <w:rPr>
           <w:sz w:val="20"/>
         </w:rPr>
-        <w:t>10.  □  Piekeren over sociale contacten (0--10)</w:t>
+        <w:t>10.  □  Bewust sociaal contact opgezocht of beantwoord vandaag (ja/nee)</w:t>
       </w:r>
     </w:p>
     <w:p>
@@ -2440,7 +2440,7 @@
         <w:rPr>
           <w:sz w:val="20"/>
         </w:rPr>
-        <w:t>11.  □  Kort dagboekmoment voor het slapengaan (min)</w:t>
+        <w:t>11.  □  Tijdsduur preslaap-dagboek of takennotitie (min)</w:t>
       </w:r>
     </w:p>
     <w:p>
@@ -2464,7 +2464,7 @@
         <w:rPr>
           <w:sz w:val="20"/>
         </w:rPr>
-        <w:t>13.  □  Concentratie overdag (0--10)</w:t>
+        <w:t>13.  □  Schermvrije pauze tijdens werkdag genomen (min)</w:t>
       </w:r>
     </w:p>
     <w:p>
@@ -2488,7 +2488,7 @@
         <w:rPr>
           <w:sz w:val="20"/>
         </w:rPr>
-        <w:t>15.  □  Sociaal contact vandaag geinitieerd (ja/nee)</w:t>
+        <w:t>15.  □  Geplande sociale activiteit bijgewoond of geïnitieerd (ja/nee)</w:t>
       </w:r>
     </w:p>
     <w:p>
@@ -2512,7 +2512,7 @@
         <w:rPr>
           <w:sz w:val="20"/>
         </w:rPr>
-        <w:t>17.  □  Duur matige tot intensieve sportactiviteit vandaag (min)</w:t>
+        <w:t>17.  □  Duur matige tot intensieve lichaamsbeweging vandaag (min)</w:t>
       </w:r>
     </w:p>
     <w:p>
@@ -2524,7 +2524,7 @@
         <w:rPr>
           <w:sz w:val="20"/>
         </w:rPr>
-        <w:t>18.  □  Spierspanning lage rug (0--10)</w:t>
+        <w:t>18.  □  Ontspanningsoefening gericht op spierspanning uitgevoerd (min)</w:t>
       </w:r>
     </w:p>
     <w:p>
@@ -2536,7 +2536,7 @@
         <w:rPr>
           <w:sz w:val="20"/>
         </w:rPr>
-        <w:t>19.  □  Inslaapduur gisteren (min)</w:t>
+        <w:t>19.  □  Vast slaapritueel gevolgd voor het slapengaan (ja/nee)</w:t>
       </w:r>
     </w:p>
     <w:p>
@@ -2548,7 +2548,7 @@
         <w:rPr>
           <w:sz w:val="20"/>
         </w:rPr>
-        <w:t>20.  □  Eetlust bij avondmaal (0--10)</w:t>
+        <w:t>20.  □  Avondmaaltijd op vaste tijd genuttigd (ja/nee)</w:t>
       </w:r>
     </w:p>
     <w:p/>
@@ -2658,7 +2658,7 @@
         <w:rPr>
           <w:sz w:val="20"/>
         </w:rPr>
-        <w:t xml:space="preserve"> 1.  □  Exposurestap uit hierarchie uitgevoerd (ja/nee)</w:t>
+        <w:t xml:space="preserve"> 1.  □  Geplande exposurestap bewust en volledig uitgevoerd vandaag (ja/nee)</w:t>
       </w:r>
     </w:p>
     <w:p>
@@ -2682,7 +2682,7 @@
         <w:rPr>
           <w:sz w:val="20"/>
         </w:rPr>
-        <w:t xml:space="preserve"> 3.  □  Rusthartslag bij ontwaken (slagen/min)</w:t>
+        <w:t xml:space="preserve"> 3.  □  Consistent slaap- en waktijdstip aangehouden (ja/nee)</w:t>
       </w:r>
     </w:p>
     <w:p>
@@ -2694,7 +2694,7 @@
         <w:rPr>
           <w:sz w:val="20"/>
         </w:rPr>
-        <w:t xml:space="preserve"> 4.  □  Duur verblijf in vermeden situatie (min)</w:t>
+        <w:t xml:space="preserve"> 4.  □  Duur verblijf in eerder vermeden of angststimulerende situatie (min)</w:t>
       </w:r>
     </w:p>
     <w:p>
@@ -2706,7 +2706,7 @@
         <w:rPr>
           <w:sz w:val="20"/>
         </w:rPr>
-        <w:t xml:space="preserve"> 5.  □  Spierspanning in schouders (0--10)</w:t>
+        <w:t xml:space="preserve"> 5.  □  Bewuste ontspanningsoefening of ademhaling bij spanning toegepast (min)</w:t>
       </w:r>
     </w:p>
     <w:p>
@@ -2718,7 +2718,7 @@
         <w:rPr>
           <w:sz w:val="20"/>
         </w:rPr>
-        <w:t xml:space="preserve"> 6.  □  Sociale contacten vandaag (aantal)</w:t>
+        <w:t xml:space="preserve"> 6.  □  Sociale activiteit of contact bewust opgezocht vandaag (ja/nee)</w:t>
       </w:r>
     </w:p>
     <w:p>
@@ -2730,7 +2730,7 @@
         <w:rPr>
           <w:sz w:val="20"/>
         </w:rPr>
-        <w:t xml:space="preserve"> 7.  □  Concrete veiligheidsactie bewust nagelaten (ja/nee)</w:t>
+        <w:t xml:space="preserve"> 7.  □  Veiligheidsactie bewust nagelaten bij angstsituatie (ja/nee)</w:t>
       </w:r>
     </w:p>
     <w:p>
@@ -2742,7 +2742,7 @@
         <w:rPr>
           <w:sz w:val="20"/>
         </w:rPr>
-        <w:t xml:space="preserve"> 8.  □  Stress op het werk (0--10)</w:t>
+        <w:t xml:space="preserve"> 8.  □  Werkstructuur of dagindeling bewust gevolgd vandaag (ja/nee)</w:t>
       </w:r>
     </w:p>
     <w:p>
@@ -2754,7 +2754,7 @@
         <w:rPr>
           <w:sz w:val="20"/>
         </w:rPr>
-        <w:t xml:space="preserve"> 9.  □  Inslaaptijd afgelopen nacht (min)</w:t>
+        <w:t xml:space="preserve"> 9.  □  Plezierige activiteit buiten werk gepland en uitgevoerd (ja/nee)</w:t>
       </w:r>
     </w:p>
     <w:p>
@@ -2766,7 +2766,7 @@
         <w:rPr>
           <w:sz w:val="20"/>
         </w:rPr>
-        <w:t>10.  □  Aantal vermijdingshandelingen ingeperkt vandaag (aantal)</w:t>
+        <w:t>10.  □  Aantal veiligheidsgedragingen bewust uitgesteld of vermeden vandaag (aantal)</w:t>
       </w:r>
     </w:p>
     <w:p>
@@ -2790,7 +2790,7 @@
         <w:rPr>
           <w:sz w:val="20"/>
         </w:rPr>
-        <w:t>12.  □  Plezier in vrijetijdsactiviteit (0--10)</w:t>
+        <w:t>12.  □  Lichaamsbeweging of wandeling buiten uitgevoerd (min)</w:t>
       </w:r>
     </w:p>
     <w:p>
@@ -2802,7 +2802,7 @@
         <w:rPr>
           <w:sz w:val="20"/>
         </w:rPr>
-        <w:t>13.  □  Lichamelijke sensaties bewust geobserveerd zonder te handelen (min)</w:t>
+        <w:t>13.  □  Interoceptieve exposureoefening bewust uitgevoerd (min)</w:t>
       </w:r>
     </w:p>
     <w:p>
@@ -2814,7 +2814,7 @@
         <w:rPr>
           <w:sz w:val="20"/>
         </w:rPr>
-        <w:t>14.  □  Aantal dutjes overdag (min)</w:t>
+        <w:t>14.  □  Middagdutje genomen (ja/nee)</w:t>
       </w:r>
     </w:p>
     <w:p>
@@ -2826,7 +2826,7 @@
         <w:rPr>
           <w:sz w:val="20"/>
         </w:rPr>
-        <w:t>15.  □  Eetlust vandaag (0--10)</w:t>
+        <w:t>15.  □  Maaltijd op vaste tijden genuttigd (ja/nee)</w:t>
       </w:r>
     </w:p>
     <w:p>
@@ -2838,7 +2838,7 @@
         <w:rPr>
           <w:sz w:val="20"/>
         </w:rPr>
-        <w:t>16.  □  Stemmingsval in de namiddag (0--10)</w:t>
+        <w:t>16.  □  Middagpauze bewust weggestapt van werkplek of drukke omgeving (ja/nee)</w:t>
       </w:r>
     </w:p>
     <w:p>
@@ -2850,7 +2850,7 @@
         <w:rPr>
           <w:sz w:val="20"/>
         </w:rPr>
-        <w:t>17.  □  Aandacht bewust van lichaamssensaties afgeleid (ja/nee)</w:t>
+        <w:t>17.  □  Lichamelijke sensaties benoemd zonder vlucht- of veiligheidsreactie (ja/nee)</w:t>
       </w:r>
     </w:p>
     <w:p>
@@ -2862,7 +2862,7 @@
         <w:rPr>
           <w:sz w:val="20"/>
         </w:rPr>
-        <w:t>18.  □  Stapelteller vandaag (aantal)</w:t>
+        <w:t>18.  □  Stappentelling overdag (stappen)</w:t>
       </w:r>
     </w:p>
     <w:p>
@@ -2874,7 +2874,7 @@
         <w:rPr>
           <w:sz w:val="20"/>
         </w:rPr>
-        <w:t>19.  □  Concentratie tijdens administratie (0--10)</w:t>
+        <w:t>19.  □  Sociale steun of gezelschap bewust opgezocht vandaag (ja/nee)</w:t>
       </w:r>
     </w:p>
     <w:p>
@@ -2886,7 +2886,7 @@
         <w:rPr>
           <w:sz w:val="20"/>
         </w:rPr>
-        <w:t>20.  □  Alcoholinname vanavond (aantal)</w:t>
+        <w:t>20.  □  Alcoholinname vanavond (eenheden)</w:t>
       </w:r>
     </w:p>
     <w:p/>

</xml_diff>

<commit_message>
HCP_1–5: simplify slot labels, subtitles in voorbeeldbox, concise Part 3, Part 4 domain standardisation, remove Borsboom ref
- Remove '(2–5 woorden)' / '(2–6 woorden)' from symptoom/behandelingsoptie slot macros
- Upgrade voorbeeldbox macro to [3] args; add italic subtitle line per deel in every example box
- Part 3: replace three-criteria enumerate block with one concise sentence (all 5 files)
- Remove (Borsboom & Cramer, 2013) citation from all 5 files
- Part 4: standardise abstract domain examples to 'Slaapkwaliteit' / 'Voedingskwaliteit'
- Part 4: reword sub-behandelingsoptie bullet to 'concrete gedragsoperationalisering'
- Part 4 voorbeeld: 'Slaap en avondontspanning' → 'Slaapkwaliteit'; update both counterexamples
- Word docs: remove '(2–N woorden)' from all slot labels; insert italic subtitle after each Deel heading
- Recompile all 5 PDFs

Co-Authored-By: Claude Sonnet 4.6 <noreply@anthropic.com>
</commit_message>
<xml_diff>
--- a/evaluation/qualtrics/01_HCPs_PRE/separate_HCPs/HCP_1/main.docx
+++ b/evaluation/qualtrics/01_HCPs_PRE/separate_HCPs/HCP_1/main.docx
@@ -1070,6 +1070,17 @@
       </w:r>
     </w:p>
     <w:p>
+      <w:pPr/>
+      <w:r>
+        <w:rPr>
+          <w:i/>
+          <w:sz w:val="20"/>
+          <w:szCs w:val="20"/>
+        </w:rPr>
+        <w:t xml:space="preserve">Hoe formuleert u een correct symptoomlabel?</w:t>
+      </w:r>
+    </w:p>
+    <w:p>
       <w:pPr>
         <w:jc w:val="left"/>
         <w:shd w:val="clear" w:color="auto" w:fill="DBEAFE"/>
@@ -1140,7 +1151,7 @@
           <w:b/>
           <w:sz w:val="20"/>
         </w:rPr>
-        <w:t xml:space="preserve">Criterium 1  Label (2-5 woorden):  </w:t>
+        <w:t xml:space="preserve">Criterium 1  Label:  </w:t>
       </w:r>
       <w:r>
         <w:rPr>
@@ -1156,7 +1167,7 @@
           <w:b/>
           <w:sz w:val="20"/>
         </w:rPr>
-        <w:t xml:space="preserve">Criterium 2  Label (2-5 woorden):  </w:t>
+        <w:t xml:space="preserve">Criterium 2  Label:  </w:t>
       </w:r>
       <w:r>
         <w:rPr>
@@ -1172,7 +1183,7 @@
           <w:b/>
           <w:sz w:val="20"/>
         </w:rPr>
-        <w:t xml:space="preserve">Criterium 3  Label (2-5 woorden):  </w:t>
+        <w:t xml:space="preserve">Criterium 3  Label:  </w:t>
       </w:r>
       <w:r>
         <w:rPr>
@@ -1188,7 +1199,7 @@
           <w:b/>
           <w:sz w:val="20"/>
         </w:rPr>
-        <w:t xml:space="preserve">Criterium 4  Label (2-5 woorden):  </w:t>
+        <w:t xml:space="preserve">Criterium 4  Label:  </w:t>
       </w:r>
       <w:r>
         <w:rPr>
@@ -1204,7 +1215,7 @@
           <w:b/>
           <w:sz w:val="20"/>
         </w:rPr>
-        <w:t xml:space="preserve">Criterium 5  Label (2-5 woorden):  </w:t>
+        <w:t xml:space="preserve">Criterium 5  Label:  </w:t>
       </w:r>
       <w:r>
         <w:rPr>
@@ -1220,7 +1231,7 @@
           <w:b/>
           <w:sz w:val="20"/>
         </w:rPr>
-        <w:t xml:space="preserve">Criterium 6  Label (2-5 woorden):  </w:t>
+        <w:t xml:space="preserve">Criterium 6  Label:  </w:t>
       </w:r>
       <w:r>
         <w:rPr>
@@ -1289,7 +1300,7 @@
           <w:b/>
           <w:sz w:val="20"/>
         </w:rPr>
-        <w:t xml:space="preserve">Criterium 1  Label (2-5 woorden):  </w:t>
+        <w:t xml:space="preserve">Criterium 1  Label:  </w:t>
       </w:r>
       <w:r>
         <w:rPr>
@@ -1305,7 +1316,7 @@
           <w:b/>
           <w:sz w:val="20"/>
         </w:rPr>
-        <w:t xml:space="preserve">Criterium 2  Label (2-5 woorden):  </w:t>
+        <w:t xml:space="preserve">Criterium 2  Label:  </w:t>
       </w:r>
       <w:r>
         <w:rPr>
@@ -1321,7 +1332,7 @@
           <w:b/>
           <w:sz w:val="20"/>
         </w:rPr>
-        <w:t xml:space="preserve">Criterium 3  Label (2-5 woorden):  </w:t>
+        <w:t xml:space="preserve">Criterium 3  Label:  </w:t>
       </w:r>
       <w:r>
         <w:rPr>
@@ -1337,7 +1348,7 @@
           <w:b/>
           <w:sz w:val="20"/>
         </w:rPr>
-        <w:t xml:space="preserve">Criterium 4  Label (2-5 woorden):  </w:t>
+        <w:t xml:space="preserve">Criterium 4  Label:  </w:t>
       </w:r>
       <w:r>
         <w:rPr>
@@ -1353,7 +1364,7 @@
           <w:b/>
           <w:sz w:val="20"/>
         </w:rPr>
-        <w:t xml:space="preserve">Criterium 5  Label (2-5 woorden):  </w:t>
+        <w:t xml:space="preserve">Criterium 5  Label:  </w:t>
       </w:r>
       <w:r>
         <w:rPr>
@@ -1369,7 +1380,7 @@
           <w:b/>
           <w:sz w:val="20"/>
         </w:rPr>
-        <w:t xml:space="preserve">Criterium 6  Label (2-5 woorden):  </w:t>
+        <w:t xml:space="preserve">Criterium 6  Label:  </w:t>
       </w:r>
       <w:r>
         <w:rPr>
@@ -1394,6 +1405,17 @@
       </w:r>
     </w:p>
     <w:p>
+      <w:pPr/>
+      <w:r>
+        <w:rPr>
+          <w:i/>
+          <w:sz w:val="20"/>
+          <w:szCs w:val="20"/>
+        </w:rPr>
+        <w:t xml:space="preserve">Hoe genereert u behandelingsoptielabels?</w:t>
+      </w:r>
+    </w:p>
+    <w:p>
       <w:pPr>
         <w:jc w:val="left"/>
         <w:shd w:val="clear" w:color="auto" w:fill="D1FAE5"/>
@@ -1510,7 +1532,7 @@
           <w:b/>
           <w:sz w:val="20"/>
         </w:rPr>
-        <w:t xml:space="preserve">Predictor 1  Label (2-6 woorden):  </w:t>
+        <w:t xml:space="preserve">Predictor 1  Label:  </w:t>
       </w:r>
       <w:r>
         <w:rPr>
@@ -1526,7 +1548,7 @@
           <w:b/>
           <w:sz w:val="20"/>
         </w:rPr>
-        <w:t xml:space="preserve">Predictor 2  Label (2-6 woorden):  </w:t>
+        <w:t xml:space="preserve">Predictor 2  Label:  </w:t>
       </w:r>
       <w:r>
         <w:rPr>
@@ -1542,7 +1564,7 @@
           <w:b/>
           <w:sz w:val="20"/>
         </w:rPr>
-        <w:t xml:space="preserve">Predictor 3  Label (2-6 woorden):  </w:t>
+        <w:t xml:space="preserve">Predictor 3  Label:  </w:t>
       </w:r>
       <w:r>
         <w:rPr>
@@ -1558,7 +1580,7 @@
           <w:b/>
           <w:sz w:val="20"/>
         </w:rPr>
-        <w:t xml:space="preserve">Predictor 4  Label (2-6 woorden):  </w:t>
+        <w:t xml:space="preserve">Predictor 4  Label:  </w:t>
       </w:r>
       <w:r>
         <w:rPr>
@@ -1574,7 +1596,7 @@
           <w:b/>
           <w:sz w:val="20"/>
         </w:rPr>
-        <w:t xml:space="preserve">Predictor 5  Label (2-6 woorden):  </w:t>
+        <w:t xml:space="preserve">Predictor 5  Label:  </w:t>
       </w:r>
       <w:r>
         <w:rPr>
@@ -1689,7 +1711,7 @@
           <w:b/>
           <w:sz w:val="20"/>
         </w:rPr>
-        <w:t xml:space="preserve">Predictor 1  Label (2-6 woorden):  </w:t>
+        <w:t xml:space="preserve">Predictor 1  Label:  </w:t>
       </w:r>
       <w:r>
         <w:rPr>
@@ -1705,7 +1727,7 @@
           <w:b/>
           <w:sz w:val="20"/>
         </w:rPr>
-        <w:t xml:space="preserve">Predictor 2  Label (2-6 woorden):  </w:t>
+        <w:t xml:space="preserve">Predictor 2  Label:  </w:t>
       </w:r>
       <w:r>
         <w:rPr>
@@ -1721,7 +1743,7 @@
           <w:b/>
           <w:sz w:val="20"/>
         </w:rPr>
-        <w:t xml:space="preserve">Predictor 3  Label (2-6 woorden):  </w:t>
+        <w:t xml:space="preserve">Predictor 3  Label:  </w:t>
       </w:r>
       <w:r>
         <w:rPr>
@@ -1737,7 +1759,7 @@
           <w:b/>
           <w:sz w:val="20"/>
         </w:rPr>
-        <w:t xml:space="preserve">Predictor 4  Label (2-6 woorden):  </w:t>
+        <w:t xml:space="preserve">Predictor 4  Label:  </w:t>
       </w:r>
       <w:r>
         <w:rPr>
@@ -1753,7 +1775,7 @@
           <w:b/>
           <w:sz w:val="20"/>
         </w:rPr>
-        <w:t xml:space="preserve">Predictor 5  Label (2-6 woorden):  </w:t>
+        <w:t xml:space="preserve">Predictor 5  Label:  </w:t>
       </w:r>
       <w:r>
         <w:rPr>
@@ -1775,6 +1797,17 @@
       </w:pPr>
       <w:r>
         <w:t>4  Deel 3: Prioritering van behandeldoelen</w:t>
+      </w:r>
+    </w:p>
+    <w:p>
+      <w:pPr/>
+      <w:r>
+        <w:rPr>
+          <w:i/>
+          <w:sz w:val="20"/>
+          <w:szCs w:val="20"/>
+        </w:rPr>
+        <w:t xml:space="preserve">Hoe leest u het netwerk en rangschikt u de behandelingsopties?</w:t>
       </w:r>
     </w:p>
     <w:p>
@@ -2212,6 +2245,17 @@
       </w:r>
     </w:p>
     <w:p>
+      <w:pPr/>
+      <w:r>
+        <w:rPr>
+          <w:i/>
+          <w:sz w:val="20"/>
+          <w:szCs w:val="20"/>
+        </w:rPr>
+        <w:t xml:space="preserve">Hoe selecteert u de meest passende EMA-items per behandeldoel?</w:t>
+      </w:r>
+    </w:p>
+    <w:p>
       <w:pPr>
         <w:jc w:val="left"/>
         <w:shd w:val="clear" w:color="auto" w:fill="EDE9FE"/>
@@ -2911,6 +2955,17 @@
       </w:pPr>
       <w:r>
         <w:t>6  Deel 5: Mobiele coachingsboodschap</w:t>
+      </w:r>
+    </w:p>
+    <w:p>
+      <w:pPr/>
+      <w:r>
+        <w:rPr>
+          <w:i/>
+          <w:sz w:val="20"/>
+          <w:szCs w:val="20"/>
+        </w:rPr>
+        <w:t xml:space="preserve">Hoe formuleert u een effectieve coachingsboodschap?</w:t>
       </w:r>
     </w:p>
     <w:p>

</xml_diff>